<commit_message>
Refine all diagrams across Lab 1 and Lab 2: compact proportions, zero overlaps, clean orthogonal routing and isolated labels
Co-authored-by: arena-agent <297053741+arena-agent@users.noreply.github.com>
</commit_message>
<xml_diff>
--- a/reports/lab1/LR1_Report_Variant15.docx
+++ b/reports/lab1/LR1_Report_Variant15.docx
@@ -1885,7 +1885,7 @@
       <w:r>
         <w:drawing>
           <wp:inline xmlns:a="http://schemas.openxmlformats.org/drawingml/2006/main" xmlns:pic="http://schemas.openxmlformats.org/drawingml/2006/picture">
-            <wp:extent cx="6035040" cy="4670332"/>
+            <wp:extent cx="6035040" cy="4686428"/>
             <wp:docPr id="1" name="Picture 1"/>
             <wp:cNvGraphicFramePr>
               <a:graphicFrameLocks noChangeAspect="1"/>
@@ -1906,7 +1906,7 @@
                   <pic:spPr>
                     <a:xfrm>
                       <a:off x="0" y="0"/>
-                      <a:ext cx="6035040" cy="4670332"/>
+                      <a:ext cx="6035040" cy="4686428"/>
                     </a:xfrm>
                     <a:prstGeom prst="rect"/>
                   </pic:spPr>

</xml_diff>

<commit_message>
Finalize all UML diagrams: strict UML 2.5 sequence notation, remove dark headers, rebuild docx/pdf reports
Co-authored-by: arena-agent <297053741+arena-agent@users.noreply.github.com>
</commit_message>
<xml_diff>
--- a/reports/lab1/LR1_Report_Variant15.docx
+++ b/reports/lab1/LR1_Report_Variant15.docx
@@ -1885,7 +1885,7 @@
       <w:r>
         <w:drawing>
           <wp:inline xmlns:a="http://schemas.openxmlformats.org/drawingml/2006/main" xmlns:pic="http://schemas.openxmlformats.org/drawingml/2006/picture">
-            <wp:extent cx="6035040" cy="4686428"/>
+            <wp:extent cx="6035040" cy="4367064"/>
             <wp:docPr id="1" name="Picture 1"/>
             <wp:cNvGraphicFramePr>
               <a:graphicFrameLocks noChangeAspect="1"/>
@@ -1906,7 +1906,7 @@
                   <pic:spPr>
                     <a:xfrm>
                       <a:off x="0" y="0"/>
-                      <a:ext cx="6035040" cy="4686428"/>
+                      <a:ext cx="6035040" cy="4367064"/>
                     </a:xfrm>
                     <a:prstGeom prst="rect"/>
                   </pic:spPr>

</xml_diff>

<commit_message>
Refine Use Case diagram: label all inter-use-case relations with stereotypes and strictly orthogonalize administrator associations
Co-authored-by: arena-agent <297053741+arena-agent@users.noreply.github.com>
</commit_message>
<xml_diff>
--- a/reports/lab1/LR1_Report_Variant15.docx
+++ b/reports/lab1/LR1_Report_Variant15.docx
@@ -1885,7 +1885,7 @@
       <w:r>
         <w:drawing>
           <wp:inline xmlns:a="http://schemas.openxmlformats.org/drawingml/2006/main" xmlns:pic="http://schemas.openxmlformats.org/drawingml/2006/picture">
-            <wp:extent cx="6035040" cy="4367064"/>
+            <wp:extent cx="6035040" cy="4381604"/>
             <wp:docPr id="1" name="Picture 1"/>
             <wp:cNvGraphicFramePr>
               <a:graphicFrameLocks noChangeAspect="1"/>
@@ -1906,7 +1906,7 @@
                   <pic:spPr>
                     <a:xfrm>
                       <a:off x="0" y="0"/>
-                      <a:ext cx="6035040" cy="4367064"/>
+                      <a:ext cx="6035040" cy="4381604"/>
                     </a:xfrm>
                     <a:prstGeom prst="rect"/>
                   </pic:spPr>

</xml_diff>

<commit_message>
Remove supervisor/reviewer block from all report title pages
Co-authored-by: arena-agent <297053741+arena-agent@users.noreply.github.com>
</commit_message>
<xml_diff>
--- a/reports/lab1/LR1_Report_Variant15.docx
+++ b/reports/lab1/LR1_Report_Variant15.docx
@@ -30,6 +30,7 @@
     <w:p/>
     <w:p/>
     <w:p/>
+    <w:p/>
     <w:p>
       <w:pPr>
         <w:spacing w:after="120"/>
@@ -69,6 +70,8 @@
         <w:t>Вариант № 15: «Университет. Центр аккредитации и независимой оценки качества образования (АНОК)»</w:t>
       </w:r>
     </w:p>
+    <w:p/>
+    <w:p/>
     <w:p/>
     <w:p/>
     <w:p/>
@@ -88,15 +91,9 @@
         <w:br/>
         <w:t>Иванов И.И.</w:t>
         <w:br/>
-        <w:br/>
-        <w:t>Проверил:</w:t>
-        <w:br/>
-        <w:t>к.т.н., доцент</w:t>
-        <w:br/>
-        <w:t>Петров П.П.</w:t>
-        <w:br/>
       </w:r>
     </w:p>
+    <w:p/>
     <w:p/>
     <w:p/>
     <w:p/>

</xml_diff>

<commit_message>
Remove ASCII use case scheme from first report
Co-authored-by: arena-agent <297053741+arena-agent@users.noreply.github.com>
</commit_message>
<xml_diff>
--- a/reports/lab1/LR1_Report_Variant15.docx
+++ b/reports/lab1/LR1_Report_Variant15.docx
@@ -3423,75 +3423,6 @@
           <w:sz w:val="24"/>
         </w:rPr>
         <w:t>Рисунок 1 — Диаграмма вариантов использования портала (Use Case)</w:t>
-      </w:r>
-    </w:p>
-    <w:p>
-      <w:pPr>
-        <w:spacing w:before="120" w:after="120"/>
-        <w:ind w:left="567"/>
-      </w:pPr>
-      <w:r>
-        <w:rPr>
-          <w:rFonts w:ascii="Courier New" w:hAnsi="Courier New"/>
-          <w:sz w:val="20"/>
-        </w:rPr>
-        <w:t xml:space="preserve">                       +-------------------------------------------------------+</w:t>
-        <w:br/>
-        <w:t xml:space="preserve">                       |   Корпоративный портал Университета (Модуль АНОК)     |</w:t>
-        <w:br/>
-        <w:t xml:space="preserve">                       |                                                       |</w:t>
-        <w:br/>
-        <w:t>[Выпускающее подр.] ---+---&gt; (Разработка и загрузка проекта УП)                |</w:t>
-        <w:br/>
-        <w:t xml:space="preserve">       |               |                 |                                     |</w:t>
-        <w:br/>
-        <w:t xml:space="preserve">       |               |                 | &lt;&lt;include&gt;&gt;                         |</w:t>
-        <w:br/>
-        <w:t xml:space="preserve">       |               |                 v                                     |</w:t>
-        <w:br/>
-        <w:t xml:space="preserve">       +---------------+---&gt; (Проверка УП на соответствие ФГОС) &lt;---+---------- [Эксперт АНОК]</w:t>
-        <w:br/>
-        <w:t xml:space="preserve">       |               |                 ^                          |                  |</w:t>
-        <w:br/>
-        <w:t xml:space="preserve">       |               |                 | &lt;&lt;include&gt;&gt;              |                  |</w:t>
-        <w:br/>
-        <w:t xml:space="preserve">       +---&gt; (Создание СЗ на изм.)       |                          |                  |</w:t>
-        <w:br/>
-        <w:t xml:space="preserve">       |           |   |                 |                          |                  |</w:t>
-        <w:br/>
-        <w:t xml:space="preserve">       | &lt;&lt;extend&gt;&gt;|   +---&gt; (Внесение изменений в УП) &lt;------------+                  |</w:t>
-        <w:br/>
-        <w:t xml:space="preserve">       |           v   |                                                               |</w:t>
-        <w:br/>
-        <w:t>[Реализ. подр.] ------&gt; (Согласование служебной записки)                               |</w:t>
-        <w:br/>
-        <w:t xml:space="preserve">                       |                                                               |</w:t>
-        <w:br/>
-        <w:t>[Выпускающее подр.] ---+                                                               |</w:t>
-        <w:br/>
-        <w:t>[Начальник АНОК] ------+---&gt; (Подписание и согласование УП)                            |</w:t>
-        <w:br/>
-        <w:t>[Проректор по УР] -----+                                                               |</w:t>
-        <w:br/>
-        <w:t xml:space="preserve">                       |                                                               |</w:t>
-        <w:br/>
-        <w:t>[Ректор / Уч. совет] --+---&gt; (Утверждение УП на Ученом совете)                         |</w:t>
-        <w:br/>
-        <w:t xml:space="preserve">                       |                                                               |</w:t>
-        <w:br/>
-        <w:t>[Эксперт АНОК] --------+---&gt; (Формирование отчетов и печатных форм)                    |</w:t>
-        <w:br/>
-        <w:t xml:space="preserve">                       |                                                               |</w:t>
-        <w:br/>
-        <w:t>[Студент/Преподаватель]-&gt; (Просмотр утвержденных УП и дисциплин)                       |</w:t>
-        <w:br/>
-        <w:t xml:space="preserve">                       |                                                               |</w:t>
-        <w:br/>
-        <w:t>[Администратор] -------+---&gt; (Ведение справочников ФГОС, кафедр, ОП)                   |</w:t>
-        <w:br/>
-        <w:t>[Администратор] -------+---&gt; (Управление правами доступа и учетными записями)          |</w:t>
-        <w:br/>
-        <w:t xml:space="preserve">                       +-------------------------------------------------------+</w:t>
       </w:r>
     </w:p>
     <w:p>

</xml_diff>

<commit_message>
Update report author to Solovyev P-41
Co-authored-by: arena-agent <297053741+arena-agent@users.noreply.github.com>
</commit_message>
<xml_diff>
--- a/reports/lab1/LR1_Report_Variant15.docx
+++ b/reports/lab1/LR1_Report_Variant15.docx
@@ -87,9 +87,9 @@
         </w:rPr>
         <w:t>Выполнил:</w:t>
         <w:br/>
-        <w:t>студент группы ИВТ-401</w:t>
+        <w:t>студент группы П-41</w:t>
         <w:br/>
-        <w:t>Иванов И.И.</w:t>
+        <w:t>Соловьёв А.С.</w:t>
         <w:br/>
       </w:r>
     </w:p>

</xml_diff>

<commit_message>
Fix symbol rendering in generated reports
Co-authored-by: arena-agent <297053741+arena-agent@users.noreply.github.com>
</commit_message>
<xml_diff>
--- a/reports/lab1/LR1_Report_Variant15.docx
+++ b/reports/lab1/LR1_Report_Variant15.docx
@@ -116,6 +116,8 @@
       <w:r>
         <w:rPr>
           <w:rFonts w:ascii="Times New Roman" w:hAnsi="Times New Roman"/>
+          <w:b w:val="0"/>
+          <w:i w:val="0"/>
           <w:sz w:val="28"/>
         </w:rPr>
         <w:t>Целью лабораторной работы является исследование предметной области Центра аккредитации и независимой оценки качества образования университета (Центр АНОК), выявление и формализация функциональных и нефункциональных требований к корпоративному порталу, разработка диаграммы вариантов использования (Use Case Diagram), а также проведение сравнительного анализа и обоснование выбора инструментального программного стека на основе бесплатного ПО с поддержкой PHP и реляционной СУБД MySQL/MariaDB (SQLite).</w:t>
@@ -144,6 +146,8 @@
       <w:r>
         <w:rPr>
           <w:rFonts w:ascii="Times New Roman" w:hAnsi="Times New Roman"/>
+          <w:b w:val="0"/>
+          <w:i w:val="0"/>
           <w:sz w:val="28"/>
         </w:rPr>
         <w:t>Центр АНОК выполняет ключевую роль в обеспечении соответствия образовательной деятельности университета требованиям Федеральных государственных образовательных стандартов высшего образования (ФГОС ВО 3++), локальных нормативных актов и регламентов аккредитационной экспертизы.</w:t>
@@ -158,6 +162,8 @@
       <w:r>
         <w:rPr>
           <w:rFonts w:ascii="Times New Roman" w:hAnsi="Times New Roman"/>
+          <w:b w:val="0"/>
+          <w:i w:val="0"/>
           <w:sz w:val="28"/>
         </w:rPr>
         <w:t xml:space="preserve">Ключевым объектом автоматизации является </w:t>
@@ -166,6 +172,7 @@
         <w:rPr>
           <w:rFonts w:ascii="Times New Roman" w:hAnsi="Times New Roman"/>
           <w:b/>
+          <w:i w:val="0"/>
           <w:sz w:val="28"/>
         </w:rPr>
         <w:t>Учебный план (УП)</w:t>
@@ -173,6 +180,8 @@
       <w:r>
         <w:rPr>
           <w:rFonts w:ascii="Times New Roman" w:hAnsi="Times New Roman"/>
+          <w:b w:val="0"/>
+          <w:i w:val="0"/>
           <w:sz w:val="28"/>
         </w:rPr>
         <w:t xml:space="preserve"> образовательной программы высшего образования, представляющий собой сложную структурированную сетку дисциплин, практик и государственной итоговой аттестации (ГИА), распределенных по семестрам с фиксацией академических часов (лекции, лабораторные, практические, самостоятельная работа студента — СРС), зачетных единиц (з.е.) и форм промежуточного контроля (экзамен, зачет, зачет с оценкой, курсовой проект/работа).</w:t>
@@ -209,13 +218,8 @@
       <w:r>
         <w:rPr>
           <w:rFonts w:ascii="Times New Roman" w:hAnsi="Times New Roman"/>
-          <w:sz w:val="28"/>
-        </w:rPr>
-      </w:r>
-      <w:r>
-        <w:rPr>
-          <w:rFonts w:ascii="Times New Roman" w:hAnsi="Times New Roman"/>
           <w:b/>
+          <w:i w:val="0"/>
           <w:sz w:val="28"/>
         </w:rPr>
         <w:t>Инициация и разработка проекта УП:</w:t>
@@ -223,6 +227,8 @@
       <w:r>
         <w:rPr>
           <w:rFonts w:ascii="Times New Roman" w:hAnsi="Times New Roman"/>
+          <w:b w:val="0"/>
+          <w:i w:val="0"/>
           <w:sz w:val="28"/>
         </w:rPr>
         <w:t xml:space="preserve"> Выпускающие кафедры формируют проект учебного плана образовательной программы бакалавриата (240 з.е.) или магистратуры (120 з.е.).</w:t>
@@ -245,13 +251,8 @@
       <w:r>
         <w:rPr>
           <w:rFonts w:ascii="Times New Roman" w:hAnsi="Times New Roman"/>
-          <w:sz w:val="28"/>
-        </w:rPr>
-      </w:r>
-      <w:r>
-        <w:rPr>
-          <w:rFonts w:ascii="Times New Roman" w:hAnsi="Times New Roman"/>
           <w:b/>
+          <w:i w:val="0"/>
           <w:sz w:val="28"/>
         </w:rPr>
         <w:t>Экспертиза и автоматическая валидация:</w:t>
@@ -259,6 +260,8 @@
       <w:r>
         <w:rPr>
           <w:rFonts w:ascii="Times New Roman" w:hAnsi="Times New Roman"/>
+          <w:b w:val="0"/>
+          <w:i w:val="0"/>
           <w:sz w:val="28"/>
         </w:rPr>
         <w:t xml:space="preserve"> Центр АНОК выполняет проверку плана на выполнение обязательных ограничений ФГОС ВО 3++:</w:t>
@@ -281,6 +284,8 @@
       <w:r>
         <w:rPr>
           <w:rFonts w:ascii="Times New Roman" w:hAnsi="Times New Roman"/>
+          <w:b w:val="0"/>
+          <w:i w:val="0"/>
           <w:sz w:val="28"/>
         </w:rPr>
         <w:t>Суммарная трудоемкость программы (240 з.е. для бакалавриата, ровно 30 з.е. в каждом семестре);</w:t>
@@ -303,9 +308,11 @@
       <w:r>
         <w:rPr>
           <w:rFonts w:ascii="Times New Roman" w:hAnsi="Times New Roman"/>
+          <w:b w:val="0"/>
+          <w:i w:val="0"/>
           <w:sz w:val="28"/>
         </w:rPr>
-        <w:t>Количество экзаменов в одну экзаменационную сессию ($\le 5$ экзаменов);</w:t>
+        <w:t>Количество экзаменов в одну экзаменационную сессию (≤ 5 экзаменов);</w:t>
       </w:r>
     </w:p>
     <w:p>
@@ -325,9 +332,11 @@
       <w:r>
         <w:rPr>
           <w:rFonts w:ascii="Times New Roman" w:hAnsi="Times New Roman"/>
+          <w:b w:val="0"/>
+          <w:i w:val="0"/>
           <w:sz w:val="28"/>
         </w:rPr>
-        <w:t>Объем практической подготовки ($\ge 12$ з.е.);</w:t>
+        <w:t>Объем практической подготовки (≥ 12 з.е.);</w:t>
       </w:r>
     </w:p>
     <w:p>
@@ -347,9 +356,11 @@
       <w:r>
         <w:rPr>
           <w:rFonts w:ascii="Times New Roman" w:hAnsi="Times New Roman"/>
+          <w:b w:val="0"/>
+          <w:i w:val="0"/>
           <w:sz w:val="28"/>
         </w:rPr>
-        <w:t>Объем государственной итоговой аттестации ($\ge 6$ з.е.);</w:t>
+        <w:t>Объем государственной итоговой аттестации (≥ 6 з.е.);</w:t>
       </w:r>
     </w:p>
     <w:p>
@@ -369,6 +380,8 @@
       <w:r>
         <w:rPr>
           <w:rFonts w:ascii="Times New Roman" w:hAnsi="Times New Roman"/>
+          <w:b w:val="0"/>
+          <w:i w:val="0"/>
           <w:sz w:val="28"/>
         </w:rPr>
         <w:t>Корректность закрепления дисциплин за обеспечивающими кафедрами.</w:t>
@@ -391,13 +404,8 @@
       <w:r>
         <w:rPr>
           <w:rFonts w:ascii="Times New Roman" w:hAnsi="Times New Roman"/>
-          <w:sz w:val="28"/>
-        </w:rPr>
-      </w:r>
-      <w:r>
-        <w:rPr>
-          <w:rFonts w:ascii="Times New Roman" w:hAnsi="Times New Roman"/>
           <w:b/>
+          <w:i w:val="0"/>
           <w:sz w:val="28"/>
         </w:rPr>
         <w:t>Маршрут согласования и утверждения:</w:t>
@@ -405,6 +413,8 @@
       <w:r>
         <w:rPr>
           <w:rFonts w:ascii="Times New Roman" w:hAnsi="Times New Roman"/>
+          <w:b w:val="0"/>
+          <w:i w:val="0"/>
           <w:sz w:val="28"/>
         </w:rPr>
         <w:t xml:space="preserve"> Проект УП последовательно визируется: Заведующий выпускающей кафедрой → Эксперт/Начальник АНОК → Проректор по учебной работе → Ректор университета с фиксацией номера и даты протокола Ученого совета.</w:t>
@@ -427,13 +437,8 @@
       <w:r>
         <w:rPr>
           <w:rFonts w:ascii="Times New Roman" w:hAnsi="Times New Roman"/>
-          <w:sz w:val="28"/>
-        </w:rPr>
-      </w:r>
-      <w:r>
-        <w:rPr>
-          <w:rFonts w:ascii="Times New Roman" w:hAnsi="Times New Roman"/>
           <w:b/>
+          <w:i w:val="0"/>
           <w:sz w:val="28"/>
         </w:rPr>
         <w:t>Внесение оперативных изменений (Служебные записки):</w:t>
@@ -441,6 +446,8 @@
       <w:r>
         <w:rPr>
           <w:rFonts w:ascii="Times New Roman" w:hAnsi="Times New Roman"/>
+          <w:b w:val="0"/>
+          <w:i w:val="0"/>
           <w:sz w:val="28"/>
         </w:rPr>
         <w:t xml:space="preserve"> При необходимости перераспределения часов, смены формы контроля или обеспечивающей кафедры оформляется электронная служебная записка (СЗ) с двусторонним согласованием (выпускающая + реализующая кафедры) и проверкой сохранения итогового баланса зачетных единиц.</w:t>
@@ -515,6 +522,7 @@
               <w:rPr>
                 <w:rFonts w:ascii="Times New Roman" w:hAnsi="Times New Roman"/>
                 <w:b/>
+                <w:i w:val="0"/>
                 <w:sz w:val="22"/>
               </w:rPr>
               <w:t>Актор</w:t>
@@ -541,6 +549,7 @@
               <w:rPr>
                 <w:rFonts w:ascii="Times New Roman" w:hAnsi="Times New Roman"/>
                 <w:b/>
+                <w:i w:val="0"/>
                 <w:sz w:val="22"/>
               </w:rPr>
               <w:t>Роль в системе</w:t>
@@ -567,6 +576,7 @@
               <w:rPr>
                 <w:rFonts w:ascii="Times New Roman" w:hAnsi="Times New Roman"/>
                 <w:b/>
+                <w:i w:val="0"/>
                 <w:sz w:val="22"/>
               </w:rPr>
               <w:t>Основные функции и зоны ответственности</w:t>
@@ -593,22 +603,37 @@
             <w:r>
               <w:rPr>
                 <w:rFonts w:ascii="Times New Roman" w:hAnsi="Times New Roman"/>
-                <w:sz w:val="22"/>
-              </w:rPr>
-            </w:r>
-            <w:r>
-              <w:rPr>
-                <w:rFonts w:ascii="Times New Roman" w:hAnsi="Times New Roman"/>
                 <w:b/>
+                <w:i w:val="0"/>
                 <w:sz w:val="22"/>
               </w:rPr>
               <w:t>Руководитель выпускающего подразделения (Зав. кафедрой)</w:t>
             </w:r>
+          </w:p>
+        </w:tc>
+        <w:tc>
+          <w:tcPr>
+            <w:tcW w:type="dxa" w:w="3118"/>
+            <w:tcMar>
+              <w:top w:w="100" w:type="dxa"/>
+              <w:bottom w:w="100" w:type="dxa"/>
+              <w:left w:w="150" w:type="dxa"/>
+              <w:right w:w="150" w:type="dxa"/>
+            </w:tcMar>
+          </w:tcPr>
+          <w:p>
+            <w:pPr>
+              <w:spacing w:before="40" w:after="40" w:line="252" w:lineRule="auto"/>
+              <w:jc w:val="left"/>
+            </w:pPr>
             <w:r>
               <w:rPr>
-                <w:rFonts w:ascii="Times New Roman" w:hAnsi="Times New Roman"/>
+                <w:rFonts w:ascii="Courier New" w:hAnsi="Courier New"/>
+                <w:b w:val="0"/>
+                <w:i w:val="0"/>
                 <w:sz w:val="22"/>
               </w:rPr>
+              <w:t>HEAD_RELEASING</w:t>
             </w:r>
           </w:p>
         </w:tc>
@@ -630,30 +655,8 @@
             <w:r>
               <w:rPr>
                 <w:rFonts w:ascii="Times New Roman" w:hAnsi="Times New Roman"/>
-                <w:sz w:val="22"/>
-              </w:rPr>
-              <w:t>`HEAD_RELEASING`</w:t>
-            </w:r>
-          </w:p>
-        </w:tc>
-        <w:tc>
-          <w:tcPr>
-            <w:tcW w:type="dxa" w:w="3118"/>
-            <w:tcMar>
-              <w:top w:w="100" w:type="dxa"/>
-              <w:bottom w:w="100" w:type="dxa"/>
-              <w:left w:w="150" w:type="dxa"/>
-              <w:right w:w="150" w:type="dxa"/>
-            </w:tcMar>
-          </w:tcPr>
-          <w:p>
-            <w:pPr>
-              <w:spacing w:before="40" w:after="40" w:line="252" w:lineRule="auto"/>
-              <w:jc w:val="left"/>
-            </w:pPr>
-            <w:r>
-              <w:rPr>
-                <w:rFonts w:ascii="Times New Roman" w:hAnsi="Times New Roman"/>
+                <w:b w:val="0"/>
+                <w:i w:val="0"/>
                 <w:sz w:val="22"/>
               </w:rPr>
               <w:t>Формирование проектов учебных планов ОП, первичное визирование ЭЦП, создание служебных записок на корректировку дисциплин.</w:t>
@@ -680,22 +683,37 @@
             <w:r>
               <w:rPr>
                 <w:rFonts w:ascii="Times New Roman" w:hAnsi="Times New Roman"/>
-                <w:sz w:val="22"/>
-              </w:rPr>
-            </w:r>
-            <w:r>
-              <w:rPr>
-                <w:rFonts w:ascii="Times New Roman" w:hAnsi="Times New Roman"/>
                 <w:b/>
+                <w:i w:val="0"/>
                 <w:sz w:val="22"/>
               </w:rPr>
               <w:t>Руководитель реализующего подразделения (Обеспечивающая каф.)</w:t>
             </w:r>
+          </w:p>
+        </w:tc>
+        <w:tc>
+          <w:tcPr>
+            <w:tcW w:type="dxa" w:w="3118"/>
+            <w:tcMar>
+              <w:top w:w="100" w:type="dxa"/>
+              <w:bottom w:w="100" w:type="dxa"/>
+              <w:left w:w="150" w:type="dxa"/>
+              <w:right w:w="150" w:type="dxa"/>
+            </w:tcMar>
+          </w:tcPr>
+          <w:p>
+            <w:pPr>
+              <w:spacing w:before="40" w:after="40" w:line="252" w:lineRule="auto"/>
+              <w:jc w:val="left"/>
+            </w:pPr>
             <w:r>
               <w:rPr>
-                <w:rFonts w:ascii="Times New Roman" w:hAnsi="Times New Roman"/>
+                <w:rFonts w:ascii="Courier New" w:hAnsi="Courier New"/>
+                <w:b w:val="0"/>
+                <w:i w:val="0"/>
                 <w:sz w:val="22"/>
               </w:rPr>
+              <w:t>HEAD_IMPLEMENTING</w:t>
             </w:r>
           </w:p>
         </w:tc>
@@ -717,30 +735,8 @@
             <w:r>
               <w:rPr>
                 <w:rFonts w:ascii="Times New Roman" w:hAnsi="Times New Roman"/>
-                <w:sz w:val="22"/>
-              </w:rPr>
-              <w:t>`HEAD_IMPLEMENTING`</w:t>
-            </w:r>
-          </w:p>
-        </w:tc>
-        <w:tc>
-          <w:tcPr>
-            <w:tcW w:type="dxa" w:w="3118"/>
-            <w:tcMar>
-              <w:top w:w="100" w:type="dxa"/>
-              <w:bottom w:w="100" w:type="dxa"/>
-              <w:left w:w="150" w:type="dxa"/>
-              <w:right w:w="150" w:type="dxa"/>
-            </w:tcMar>
-          </w:tcPr>
-          <w:p>
-            <w:pPr>
-              <w:spacing w:before="40" w:after="40" w:line="252" w:lineRule="auto"/>
-              <w:jc w:val="left"/>
-            </w:pPr>
-            <w:r>
-              <w:rPr>
-                <w:rFonts w:ascii="Times New Roman" w:hAnsi="Times New Roman"/>
+                <w:b w:val="0"/>
+                <w:i w:val="0"/>
                 <w:sz w:val="22"/>
               </w:rPr>
               <w:t>Согласование параметров закрепленных дисциплин (часы, формы контроля), визирование служебных записок.</w:t>
@@ -767,22 +763,37 @@
             <w:r>
               <w:rPr>
                 <w:rFonts w:ascii="Times New Roman" w:hAnsi="Times New Roman"/>
-                <w:sz w:val="22"/>
-              </w:rPr>
-            </w:r>
-            <w:r>
-              <w:rPr>
-                <w:rFonts w:ascii="Times New Roman" w:hAnsi="Times New Roman"/>
                 <w:b/>
+                <w:i w:val="0"/>
                 <w:sz w:val="22"/>
               </w:rPr>
               <w:t>Эксперт Центра АНОК</w:t>
             </w:r>
+          </w:p>
+        </w:tc>
+        <w:tc>
+          <w:tcPr>
+            <w:tcW w:type="dxa" w:w="3118"/>
+            <w:tcMar>
+              <w:top w:w="100" w:type="dxa"/>
+              <w:bottom w:w="100" w:type="dxa"/>
+              <w:left w:w="150" w:type="dxa"/>
+              <w:right w:w="150" w:type="dxa"/>
+            </w:tcMar>
+          </w:tcPr>
+          <w:p>
+            <w:pPr>
+              <w:spacing w:before="40" w:after="40" w:line="252" w:lineRule="auto"/>
+              <w:jc w:val="left"/>
+            </w:pPr>
             <w:r>
               <w:rPr>
-                <w:rFonts w:ascii="Times New Roman" w:hAnsi="Times New Roman"/>
+                <w:rFonts w:ascii="Courier New" w:hAnsi="Courier New"/>
+                <w:b w:val="0"/>
+                <w:i w:val="0"/>
                 <w:sz w:val="22"/>
               </w:rPr>
+              <w:t>EXPERT_ANOK</w:t>
             </w:r>
           </w:p>
         </w:tc>
@@ -804,30 +815,8 @@
             <w:r>
               <w:rPr>
                 <w:rFonts w:ascii="Times New Roman" w:hAnsi="Times New Roman"/>
-                <w:sz w:val="22"/>
-              </w:rPr>
-              <w:t>`EXPERT_ANOK`</w:t>
-            </w:r>
-          </w:p>
-        </w:tc>
-        <w:tc>
-          <w:tcPr>
-            <w:tcW w:type="dxa" w:w="3118"/>
-            <w:tcMar>
-              <w:top w:w="100" w:type="dxa"/>
-              <w:bottom w:w="100" w:type="dxa"/>
-              <w:left w:w="150" w:type="dxa"/>
-              <w:right w:w="150" w:type="dxa"/>
-            </w:tcMar>
-          </w:tcPr>
-          <w:p>
-            <w:pPr>
-              <w:spacing w:before="40" w:after="40" w:line="252" w:lineRule="auto"/>
-              <w:jc w:val="left"/>
-            </w:pPr>
-            <w:r>
-              <w:rPr>
-                <w:rFonts w:ascii="Times New Roman" w:hAnsi="Times New Roman"/>
+                <w:b w:val="0"/>
+                <w:i w:val="0"/>
                 <w:sz w:val="22"/>
               </w:rPr>
               <w:t>Проведение автоматизированной и содержательной экспертизы УП по ФГОС ВО 3++, фиксация замечаний, применение утвержденных служебных записок.</w:t>
@@ -854,22 +843,37 @@
             <w:r>
               <w:rPr>
                 <w:rFonts w:ascii="Times New Roman" w:hAnsi="Times New Roman"/>
-                <w:sz w:val="22"/>
-              </w:rPr>
-            </w:r>
-            <w:r>
-              <w:rPr>
-                <w:rFonts w:ascii="Times New Roman" w:hAnsi="Times New Roman"/>
                 <w:b/>
+                <w:i w:val="0"/>
                 <w:sz w:val="22"/>
               </w:rPr>
               <w:t>Начальник Центра АНОК</w:t>
             </w:r>
+          </w:p>
+        </w:tc>
+        <w:tc>
+          <w:tcPr>
+            <w:tcW w:type="dxa" w:w="3118"/>
+            <w:tcMar>
+              <w:top w:w="100" w:type="dxa"/>
+              <w:bottom w:w="100" w:type="dxa"/>
+              <w:left w:w="150" w:type="dxa"/>
+              <w:right w:w="150" w:type="dxa"/>
+            </w:tcMar>
+          </w:tcPr>
+          <w:p>
+            <w:pPr>
+              <w:spacing w:before="40" w:after="40" w:line="252" w:lineRule="auto"/>
+              <w:jc w:val="left"/>
+            </w:pPr>
             <w:r>
               <w:rPr>
-                <w:rFonts w:ascii="Times New Roman" w:hAnsi="Times New Roman"/>
+                <w:rFonts w:ascii="Courier New" w:hAnsi="Courier New"/>
+                <w:b w:val="0"/>
+                <w:i w:val="0"/>
                 <w:sz w:val="22"/>
               </w:rPr>
+              <w:t>HEAD_ANOK</w:t>
             </w:r>
           </w:p>
         </w:tc>
@@ -891,30 +895,8 @@
             <w:r>
               <w:rPr>
                 <w:rFonts w:ascii="Times New Roman" w:hAnsi="Times New Roman"/>
-                <w:sz w:val="22"/>
-              </w:rPr>
-              <w:t>`HEAD_ANOK`</w:t>
-            </w:r>
-          </w:p>
-        </w:tc>
-        <w:tc>
-          <w:tcPr>
-            <w:tcW w:type="dxa" w:w="3118"/>
-            <w:tcMar>
-              <w:top w:w="100" w:type="dxa"/>
-              <w:bottom w:w="100" w:type="dxa"/>
-              <w:left w:w="150" w:type="dxa"/>
-              <w:right w:w="150" w:type="dxa"/>
-            </w:tcMar>
-          </w:tcPr>
-          <w:p>
-            <w:pPr>
-              <w:spacing w:before="40" w:after="40" w:line="252" w:lineRule="auto"/>
-              <w:jc w:val="left"/>
-            </w:pPr>
-            <w:r>
-              <w:rPr>
-                <w:rFonts w:ascii="Times New Roman" w:hAnsi="Times New Roman"/>
+                <w:b w:val="0"/>
+                <w:i w:val="0"/>
                 <w:sz w:val="22"/>
               </w:rPr>
               <w:t>Утверждение результатов аккредитационной экспертизы, наложение визы АНОК в маршруте согласования.</w:t>
@@ -941,22 +923,37 @@
             <w:r>
               <w:rPr>
                 <w:rFonts w:ascii="Times New Roman" w:hAnsi="Times New Roman"/>
-                <w:sz w:val="22"/>
-              </w:rPr>
-            </w:r>
-            <w:r>
-              <w:rPr>
-                <w:rFonts w:ascii="Times New Roman" w:hAnsi="Times New Roman"/>
                 <w:b/>
+                <w:i w:val="0"/>
                 <w:sz w:val="22"/>
               </w:rPr>
               <w:t>Проректор по учебной работе</w:t>
             </w:r>
+          </w:p>
+        </w:tc>
+        <w:tc>
+          <w:tcPr>
+            <w:tcW w:type="dxa" w:w="3118"/>
+            <w:tcMar>
+              <w:top w:w="100" w:type="dxa"/>
+              <w:bottom w:w="100" w:type="dxa"/>
+              <w:left w:w="150" w:type="dxa"/>
+              <w:right w:w="150" w:type="dxa"/>
+            </w:tcMar>
+          </w:tcPr>
+          <w:p>
+            <w:pPr>
+              <w:spacing w:before="40" w:after="40" w:line="252" w:lineRule="auto"/>
+              <w:jc w:val="left"/>
+            </w:pPr>
             <w:r>
               <w:rPr>
-                <w:rFonts w:ascii="Times New Roman" w:hAnsi="Times New Roman"/>
+                <w:rFonts w:ascii="Courier New" w:hAnsi="Courier New"/>
+                <w:b w:val="0"/>
+                <w:i w:val="0"/>
                 <w:sz w:val="22"/>
               </w:rPr>
+              <w:t>VICE_RECTOR</w:t>
             </w:r>
           </w:p>
         </w:tc>
@@ -978,30 +975,8 @@
             <w:r>
               <w:rPr>
                 <w:rFonts w:ascii="Times New Roman" w:hAnsi="Times New Roman"/>
-                <w:sz w:val="22"/>
-              </w:rPr>
-              <w:t>`VICE_RECTOR`</w:t>
-            </w:r>
-          </w:p>
-        </w:tc>
-        <w:tc>
-          <w:tcPr>
-            <w:tcW w:type="dxa" w:w="3118"/>
-            <w:tcMar>
-              <w:top w:w="100" w:type="dxa"/>
-              <w:bottom w:w="100" w:type="dxa"/>
-              <w:left w:w="150" w:type="dxa"/>
-              <w:right w:w="150" w:type="dxa"/>
-            </w:tcMar>
-          </w:tcPr>
-          <w:p>
-            <w:pPr>
-              <w:spacing w:before="40" w:after="40" w:line="252" w:lineRule="auto"/>
-              <w:jc w:val="left"/>
-            </w:pPr>
-            <w:r>
-              <w:rPr>
-                <w:rFonts w:ascii="Times New Roman" w:hAnsi="Times New Roman"/>
+                <w:b w:val="0"/>
+                <w:i w:val="0"/>
                 <w:sz w:val="22"/>
               </w:rPr>
               <w:t>Согласование учебного плана на уровне руководства университета перед вынесением на Ученый совет.</w:t>
@@ -1028,22 +1003,37 @@
             <w:r>
               <w:rPr>
                 <w:rFonts w:ascii="Times New Roman" w:hAnsi="Times New Roman"/>
-                <w:sz w:val="22"/>
-              </w:rPr>
-            </w:r>
-            <w:r>
-              <w:rPr>
-                <w:rFonts w:ascii="Times New Roman" w:hAnsi="Times New Roman"/>
                 <w:b/>
+                <w:i w:val="0"/>
                 <w:sz w:val="22"/>
               </w:rPr>
               <w:t>Ректор университета</w:t>
             </w:r>
+          </w:p>
+        </w:tc>
+        <w:tc>
+          <w:tcPr>
+            <w:tcW w:type="dxa" w:w="3118"/>
+            <w:tcMar>
+              <w:top w:w="100" w:type="dxa"/>
+              <w:bottom w:w="100" w:type="dxa"/>
+              <w:left w:w="150" w:type="dxa"/>
+              <w:right w:w="150" w:type="dxa"/>
+            </w:tcMar>
+          </w:tcPr>
+          <w:p>
+            <w:pPr>
+              <w:spacing w:before="40" w:after="40" w:line="252" w:lineRule="auto"/>
+              <w:jc w:val="left"/>
+            </w:pPr>
             <w:r>
               <w:rPr>
-                <w:rFonts w:ascii="Times New Roman" w:hAnsi="Times New Roman"/>
+                <w:rFonts w:ascii="Courier New" w:hAnsi="Courier New"/>
+                <w:b w:val="0"/>
+                <w:i w:val="0"/>
                 <w:sz w:val="22"/>
               </w:rPr>
+              <w:t>RECTOR</w:t>
             </w:r>
           </w:p>
         </w:tc>
@@ -1065,30 +1055,8 @@
             <w:r>
               <w:rPr>
                 <w:rFonts w:ascii="Times New Roman" w:hAnsi="Times New Roman"/>
-                <w:sz w:val="22"/>
-              </w:rPr>
-              <w:t>`RECTOR`</w:t>
-            </w:r>
-          </w:p>
-        </w:tc>
-        <w:tc>
-          <w:tcPr>
-            <w:tcW w:type="dxa" w:w="3118"/>
-            <w:tcMar>
-              <w:top w:w="100" w:type="dxa"/>
-              <w:bottom w:w="100" w:type="dxa"/>
-              <w:left w:w="150" w:type="dxa"/>
-              <w:right w:w="150" w:type="dxa"/>
-            </w:tcMar>
-          </w:tcPr>
-          <w:p>
-            <w:pPr>
-              <w:spacing w:before="40" w:after="40" w:line="252" w:lineRule="auto"/>
-              <w:jc w:val="left"/>
-            </w:pPr>
-            <w:r>
-              <w:rPr>
-                <w:rFonts w:ascii="Times New Roman" w:hAnsi="Times New Roman"/>
+                <w:b w:val="0"/>
+                <w:i w:val="0"/>
                 <w:sz w:val="22"/>
               </w:rPr>
               <w:t>Финальное утверждение учебного плана на основании решения Ученого совета университета.</w:t>
@@ -1115,22 +1083,37 @@
             <w:r>
               <w:rPr>
                 <w:rFonts w:ascii="Times New Roman" w:hAnsi="Times New Roman"/>
-                <w:sz w:val="22"/>
-              </w:rPr>
-            </w:r>
-            <w:r>
-              <w:rPr>
-                <w:rFonts w:ascii="Times New Roman" w:hAnsi="Times New Roman"/>
                 <w:b/>
+                <w:i w:val="0"/>
                 <w:sz w:val="22"/>
               </w:rPr>
               <w:t>Секретарь Ученого совета</w:t>
             </w:r>
+          </w:p>
+        </w:tc>
+        <w:tc>
+          <w:tcPr>
+            <w:tcW w:type="dxa" w:w="3118"/>
+            <w:tcMar>
+              <w:top w:w="100" w:type="dxa"/>
+              <w:bottom w:w="100" w:type="dxa"/>
+              <w:left w:w="150" w:type="dxa"/>
+              <w:right w:w="150" w:type="dxa"/>
+            </w:tcMar>
+          </w:tcPr>
+          <w:p>
+            <w:pPr>
+              <w:spacing w:before="40" w:after="40" w:line="252" w:lineRule="auto"/>
+              <w:jc w:val="left"/>
+            </w:pPr>
             <w:r>
               <w:rPr>
-                <w:rFonts w:ascii="Times New Roman" w:hAnsi="Times New Roman"/>
+                <w:rFonts w:ascii="Courier New" w:hAnsi="Courier New"/>
+                <w:b w:val="0"/>
+                <w:i w:val="0"/>
                 <w:sz w:val="22"/>
               </w:rPr>
+              <w:t>COUNCIL_SEC</w:t>
             </w:r>
           </w:p>
         </w:tc>
@@ -1152,30 +1135,8 @@
             <w:r>
               <w:rPr>
                 <w:rFonts w:ascii="Times New Roman" w:hAnsi="Times New Roman"/>
-                <w:sz w:val="22"/>
-              </w:rPr>
-              <w:t>`COUNCIL_SEC`</w:t>
-            </w:r>
-          </w:p>
-        </w:tc>
-        <w:tc>
-          <w:tcPr>
-            <w:tcW w:type="dxa" w:w="3118"/>
-            <w:tcMar>
-              <w:top w:w="100" w:type="dxa"/>
-              <w:bottom w:w="100" w:type="dxa"/>
-              <w:left w:w="150" w:type="dxa"/>
-              <w:right w:w="150" w:type="dxa"/>
-            </w:tcMar>
-          </w:tcPr>
-          <w:p>
-            <w:pPr>
-              <w:spacing w:before="40" w:after="40" w:line="252" w:lineRule="auto"/>
-              <w:jc w:val="left"/>
-            </w:pPr>
-            <w:r>
-              <w:rPr>
-                <w:rFonts w:ascii="Times New Roman" w:hAnsi="Times New Roman"/>
+                <w:b w:val="0"/>
+                <w:i w:val="0"/>
                 <w:sz w:val="22"/>
               </w:rPr>
               <w:t>Регистрация реквизитов протоколов заседаний Ученого совета по утверждению и актуализации ОП.</w:t>
@@ -1202,22 +1163,37 @@
             <w:r>
               <w:rPr>
                 <w:rFonts w:ascii="Times New Roman" w:hAnsi="Times New Roman"/>
-                <w:sz w:val="22"/>
-              </w:rPr>
-            </w:r>
-            <w:r>
-              <w:rPr>
-                <w:rFonts w:ascii="Times New Roman" w:hAnsi="Times New Roman"/>
                 <w:b/>
+                <w:i w:val="0"/>
                 <w:sz w:val="22"/>
               </w:rPr>
               <w:t>Преподаватель / Студент</w:t>
             </w:r>
+          </w:p>
+        </w:tc>
+        <w:tc>
+          <w:tcPr>
+            <w:tcW w:type="dxa" w:w="3118"/>
+            <w:tcMar>
+              <w:top w:w="100" w:type="dxa"/>
+              <w:bottom w:w="100" w:type="dxa"/>
+              <w:left w:w="150" w:type="dxa"/>
+              <w:right w:w="150" w:type="dxa"/>
+            </w:tcMar>
+          </w:tcPr>
+          <w:p>
+            <w:pPr>
+              <w:spacing w:before="40" w:after="40" w:line="252" w:lineRule="auto"/>
+              <w:jc w:val="left"/>
+            </w:pPr>
             <w:r>
               <w:rPr>
-                <w:rFonts w:ascii="Times New Roman" w:hAnsi="Times New Roman"/>
+                <w:rFonts w:ascii="Courier New" w:hAnsi="Courier New"/>
+                <w:b w:val="0"/>
+                <w:i w:val="0"/>
                 <w:sz w:val="22"/>
               </w:rPr>
+              <w:t>VIEWER</w:t>
             </w:r>
           </w:p>
         </w:tc>
@@ -1239,30 +1215,8 @@
             <w:r>
               <w:rPr>
                 <w:rFonts w:ascii="Times New Roman" w:hAnsi="Times New Roman"/>
-                <w:sz w:val="22"/>
-              </w:rPr>
-              <w:t>`VIEWER`</w:t>
-            </w:r>
-          </w:p>
-        </w:tc>
-        <w:tc>
-          <w:tcPr>
-            <w:tcW w:type="dxa" w:w="3118"/>
-            <w:tcMar>
-              <w:top w:w="100" w:type="dxa"/>
-              <w:bottom w:w="100" w:type="dxa"/>
-              <w:left w:w="150" w:type="dxa"/>
-              <w:right w:w="150" w:type="dxa"/>
-            </w:tcMar>
-          </w:tcPr>
-          <w:p>
-            <w:pPr>
-              <w:spacing w:before="40" w:after="40" w:line="252" w:lineRule="auto"/>
-              <w:jc w:val="left"/>
-            </w:pPr>
-            <w:r>
-              <w:rPr>
-                <w:rFonts w:ascii="Times New Roman" w:hAnsi="Times New Roman"/>
+                <w:b w:val="0"/>
+                <w:i w:val="0"/>
                 <w:sz w:val="22"/>
               </w:rPr>
               <w:t>Просмотр утвержденных учебных планов, матриц компетенций, календарных графиков и объявлений.</w:t>
@@ -1289,22 +1243,37 @@
             <w:r>
               <w:rPr>
                 <w:rFonts w:ascii="Times New Roman" w:hAnsi="Times New Roman"/>
-                <w:sz w:val="22"/>
-              </w:rPr>
-            </w:r>
-            <w:r>
-              <w:rPr>
-                <w:rFonts w:ascii="Times New Roman" w:hAnsi="Times New Roman"/>
                 <w:b/>
+                <w:i w:val="0"/>
                 <w:sz w:val="22"/>
               </w:rPr>
               <w:t>Администратор портала</w:t>
             </w:r>
+          </w:p>
+        </w:tc>
+        <w:tc>
+          <w:tcPr>
+            <w:tcW w:type="dxa" w:w="3118"/>
+            <w:tcMar>
+              <w:top w:w="100" w:type="dxa"/>
+              <w:bottom w:w="100" w:type="dxa"/>
+              <w:left w:w="150" w:type="dxa"/>
+              <w:right w:w="150" w:type="dxa"/>
+            </w:tcMar>
+          </w:tcPr>
+          <w:p>
+            <w:pPr>
+              <w:spacing w:before="40" w:after="40" w:line="252" w:lineRule="auto"/>
+              <w:jc w:val="left"/>
+            </w:pPr>
             <w:r>
               <w:rPr>
-                <w:rFonts w:ascii="Times New Roman" w:hAnsi="Times New Roman"/>
+                <w:rFonts w:ascii="Courier New" w:hAnsi="Courier New"/>
+                <w:b w:val="0"/>
+                <w:i w:val="0"/>
                 <w:sz w:val="22"/>
               </w:rPr>
+              <w:t>ADMIN</w:t>
             </w:r>
           </w:p>
         </w:tc>
@@ -1326,30 +1295,8 @@
             <w:r>
               <w:rPr>
                 <w:rFonts w:ascii="Times New Roman" w:hAnsi="Times New Roman"/>
-                <w:sz w:val="22"/>
-              </w:rPr>
-              <w:t>`ADMIN`</w:t>
-            </w:r>
-          </w:p>
-        </w:tc>
-        <w:tc>
-          <w:tcPr>
-            <w:tcW w:type="dxa" w:w="3118"/>
-            <w:tcMar>
-              <w:top w:w="100" w:type="dxa"/>
-              <w:bottom w:w="100" w:type="dxa"/>
-              <w:left w:w="150" w:type="dxa"/>
-              <w:right w:w="150" w:type="dxa"/>
-            </w:tcMar>
-          </w:tcPr>
-          <w:p>
-            <w:pPr>
-              <w:spacing w:before="40" w:after="40" w:line="252" w:lineRule="auto"/>
-              <w:jc w:val="left"/>
-            </w:pPr>
-            <w:r>
-              <w:rPr>
-                <w:rFonts w:ascii="Times New Roman" w:hAnsi="Times New Roman"/>
+                <w:b w:val="0"/>
+                <w:i w:val="0"/>
                 <w:sz w:val="22"/>
               </w:rPr>
               <w:t>Управление пользователями, ролями, нормативными справочниками ФГОС, аудит безопасности и мониторинг.</w:t>
@@ -1386,6 +1333,8 @@
       <w:r>
         <w:rPr>
           <w:rFonts w:ascii="Times New Roman" w:hAnsi="Times New Roman"/>
+          <w:b w:val="0"/>
+          <w:i w:val="0"/>
           <w:sz w:val="28"/>
         </w:rPr>
         <w:t>Диаграмма вариантов использования отражает функциональные возможности портала для ключевых групп пользователей:</w:t>
@@ -1476,13 +1425,8 @@
       <w:r>
         <w:rPr>
           <w:rFonts w:ascii="Times New Roman" w:hAnsi="Times New Roman"/>
-          <w:sz w:val="28"/>
-        </w:rPr>
-      </w:r>
-      <w:r>
-        <w:rPr>
-          <w:rFonts w:ascii="Times New Roman" w:hAnsi="Times New Roman"/>
           <w:b/>
+          <w:i w:val="0"/>
           <w:sz w:val="28"/>
         </w:rPr>
         <w:t>Подсистема учебных планов:</w:t>
@@ -1490,6 +1434,8 @@
       <w:r>
         <w:rPr>
           <w:rFonts w:ascii="Times New Roman" w:hAnsi="Times New Roman"/>
+          <w:b w:val="0"/>
+          <w:i w:val="0"/>
           <w:sz w:val="28"/>
         </w:rPr>
         <w:t xml:space="preserve"> «Просмотр реестра УП», «Просмотр учебного плана по семестрам (1–8)», «Анализ аудиторной нагрузки и СРС», «Фильтрация по кафедрам».</w:t>
@@ -1512,13 +1458,8 @@
       <w:r>
         <w:rPr>
           <w:rFonts w:ascii="Times New Roman" w:hAnsi="Times New Roman"/>
-          <w:sz w:val="28"/>
-        </w:rPr>
-      </w:r>
-      <w:r>
-        <w:rPr>
-          <w:rFonts w:ascii="Times New Roman" w:hAnsi="Times New Roman"/>
           <w:b/>
+          <w:i w:val="0"/>
           <w:sz w:val="28"/>
         </w:rPr>
         <w:t>Подсистема аккредитационной экспертизы:</w:t>
@@ -1526,9 +1467,11 @@
       <w:r>
         <w:rPr>
           <w:rFonts w:ascii="Times New Roman" w:hAnsi="Times New Roman"/>
+          <w:b w:val="0"/>
+          <w:i w:val="0"/>
           <w:sz w:val="28"/>
         </w:rPr>
-        <w:t xml:space="preserve"> «Автоматическая валидация по ФГОС ВО 3++», «Контроль лимита экзаменов в сессию ($\le 5$)», «Контроль объема практик и ГИА», «Формирование протокола замечаний».</w:t>
+        <w:t xml:space="preserve"> «Автоматическая валидация по ФГОС ВО 3++», «Контроль лимита экзаменов в сессию (≤ 5)», «Контроль объема практик и ГИА», «Формирование протокола замечаний».</w:t>
       </w:r>
     </w:p>
     <w:p>
@@ -1548,13 +1491,8 @@
       <w:r>
         <w:rPr>
           <w:rFonts w:ascii="Times New Roman" w:hAnsi="Times New Roman"/>
-          <w:sz w:val="28"/>
-        </w:rPr>
-      </w:r>
-      <w:r>
-        <w:rPr>
-          <w:rFonts w:ascii="Times New Roman" w:hAnsi="Times New Roman"/>
           <w:b/>
+          <w:i w:val="0"/>
           <w:sz w:val="28"/>
         </w:rPr>
         <w:t>Подсистема электронного согласования:</w:t>
@@ -1562,6 +1500,8 @@
       <w:r>
         <w:rPr>
           <w:rFonts w:ascii="Times New Roman" w:hAnsi="Times New Roman"/>
+          <w:b w:val="0"/>
+          <w:i w:val="0"/>
           <w:sz w:val="28"/>
         </w:rPr>
         <w:t xml:space="preserve"> «Наложение цифровой визы ЭЦП», «Просмотр цепочки подписания и хэшей SHA-256», «Утверждение протокола Ученого совета».</w:t>
@@ -1584,13 +1524,8 @@
       <w:r>
         <w:rPr>
           <w:rFonts w:ascii="Times New Roman" w:hAnsi="Times New Roman"/>
-          <w:sz w:val="28"/>
-        </w:rPr>
-      </w:r>
-      <w:r>
-        <w:rPr>
-          <w:rFonts w:ascii="Times New Roman" w:hAnsi="Times New Roman"/>
           <w:b/>
+          <w:i w:val="0"/>
           <w:sz w:val="28"/>
         </w:rPr>
         <w:t>Подсистема служебных записок:</w:t>
@@ -1598,6 +1533,8 @@
       <w:r>
         <w:rPr>
           <w:rFonts w:ascii="Times New Roman" w:hAnsi="Times New Roman"/>
+          <w:b w:val="0"/>
+          <w:i w:val="0"/>
           <w:sz w:val="28"/>
         </w:rPr>
         <w:t xml:space="preserve"> «Создание СЗ на изменение УП», «Сравнение версий дисциплины ("Было" → "Стало")», «Согласование обеспечивающей кафедрой», «Применение правок в УП».</w:t>
@@ -1620,13 +1557,8 @@
       <w:r>
         <w:rPr>
           <w:rFonts w:ascii="Times New Roman" w:hAnsi="Times New Roman"/>
-          <w:sz w:val="28"/>
-        </w:rPr>
-      </w:r>
-      <w:r>
-        <w:rPr>
-          <w:rFonts w:ascii="Times New Roman" w:hAnsi="Times New Roman"/>
           <w:b/>
+          <w:i w:val="0"/>
           <w:sz w:val="28"/>
         </w:rPr>
         <w:t>Справочно-информационная подсистема:</w:t>
@@ -1634,6 +1566,8 @@
       <w:r>
         <w:rPr>
           <w:rFonts w:ascii="Times New Roman" w:hAnsi="Times New Roman"/>
+          <w:b w:val="0"/>
+          <w:i w:val="0"/>
           <w:sz w:val="28"/>
         </w:rPr>
         <w:t xml:space="preserve"> «Просмотр матрицы компетенций (УК, ОПК, ПК)», «Справочник подразделений и контактов», «Лента регламентов и объявлений АНОК», «Журнал аудита действий».</w:t>
@@ -1684,13 +1618,8 @@
       <w:r>
         <w:rPr>
           <w:rFonts w:ascii="Times New Roman" w:hAnsi="Times New Roman"/>
-          <w:sz w:val="28"/>
-        </w:rPr>
-      </w:r>
-      <w:r>
-        <w:rPr>
-          <w:rFonts w:ascii="Times New Roman" w:hAnsi="Times New Roman"/>
           <w:b/>
+          <w:i w:val="0"/>
           <w:sz w:val="28"/>
         </w:rPr>
         <w:t>ФТ-01 (Хранение ОП и УП):</w:t>
@@ -1698,6 +1627,8 @@
       <w:r>
         <w:rPr>
           <w:rFonts w:ascii="Times New Roman" w:hAnsi="Times New Roman"/>
+          <w:b w:val="0"/>
+          <w:i w:val="0"/>
           <w:sz w:val="28"/>
         </w:rPr>
         <w:t xml:space="preserve"> Хранение реестра образовательных программ с кодами направлений, уровнями образования, формами обучения и связанными версиями учебных планов.</w:t>
@@ -1720,13 +1651,8 @@
       <w:r>
         <w:rPr>
           <w:rFonts w:ascii="Times New Roman" w:hAnsi="Times New Roman"/>
-          <w:sz w:val="28"/>
-        </w:rPr>
-      </w:r>
-      <w:r>
-        <w:rPr>
-          <w:rFonts w:ascii="Times New Roman" w:hAnsi="Times New Roman"/>
           <w:b/>
+          <w:i w:val="0"/>
           <w:sz w:val="28"/>
         </w:rPr>
         <w:t>ФТ-02 (Сетка дисциплин):</w:t>
@@ -1734,6 +1660,8 @@
       <w:r>
         <w:rPr>
           <w:rFonts w:ascii="Times New Roman" w:hAnsi="Times New Roman"/>
+          <w:b w:val="0"/>
+          <w:i w:val="0"/>
           <w:sz w:val="28"/>
         </w:rPr>
         <w:t xml:space="preserve"> Хранение дисциплин с детализацией по семестрам (1–8), зачетным единицам, общим часам, часам лекций, лабораторных, практик, СРС и формам контроля.</w:t>
@@ -1756,13 +1684,8 @@
       <w:r>
         <w:rPr>
           <w:rFonts w:ascii="Times New Roman" w:hAnsi="Times New Roman"/>
-          <w:sz w:val="28"/>
-        </w:rPr>
-      </w:r>
-      <w:r>
-        <w:rPr>
-          <w:rFonts w:ascii="Times New Roman" w:hAnsi="Times New Roman"/>
           <w:b/>
+          <w:i w:val="0"/>
           <w:sz w:val="28"/>
         </w:rPr>
         <w:t>ФТ-03 (Семестровая навигация):</w:t>
@@ -1770,6 +1693,8 @@
       <w:r>
         <w:rPr>
           <w:rFonts w:ascii="Times New Roman" w:hAnsi="Times New Roman"/>
+          <w:b w:val="0"/>
+          <w:i w:val="0"/>
           <w:sz w:val="28"/>
         </w:rPr>
         <w:t xml:space="preserve"> Интерактивный просмотр учебного плана с переключением семестров и автоматическим расчетом промежуточных итогов.</w:t>
@@ -1792,13 +1717,8 @@
       <w:r>
         <w:rPr>
           <w:rFonts w:ascii="Times New Roman" w:hAnsi="Times New Roman"/>
-          <w:sz w:val="28"/>
-        </w:rPr>
-      </w:r>
-      <w:r>
-        <w:rPr>
-          <w:rFonts w:ascii="Times New Roman" w:hAnsi="Times New Roman"/>
           <w:b/>
+          <w:i w:val="0"/>
           <w:sz w:val="28"/>
         </w:rPr>
         <w:t>ФТ-04 (Нормативы ФГОС):</w:t>
@@ -1806,6 +1726,8 @@
       <w:r>
         <w:rPr>
           <w:rFonts w:ascii="Times New Roman" w:hAnsi="Times New Roman"/>
+          <w:b w:val="0"/>
+          <w:i w:val="0"/>
           <w:sz w:val="28"/>
         </w:rPr>
         <w:t xml:space="preserve"> Ведение справочника стандартов ФГОС ВО 3++ с пороговыми значениями (общие кредиты, макс. экзаменов, мин. практик, мин. ГИА).</w:t>
@@ -1828,13 +1750,8 @@
       <w:r>
         <w:rPr>
           <w:rFonts w:ascii="Times New Roman" w:hAnsi="Times New Roman"/>
-          <w:sz w:val="28"/>
-        </w:rPr>
-      </w:r>
-      <w:r>
-        <w:rPr>
-          <w:rFonts w:ascii="Times New Roman" w:hAnsi="Times New Roman"/>
           <w:b/>
+          <w:i w:val="0"/>
           <w:sz w:val="28"/>
         </w:rPr>
         <w:t>ФТ-05 (Валидация):</w:t>
@@ -1842,6 +1759,8 @@
       <w:r>
         <w:rPr>
           <w:rFonts w:ascii="Times New Roman" w:hAnsi="Times New Roman"/>
+          <w:b w:val="0"/>
+          <w:i w:val="0"/>
           <w:sz w:val="28"/>
         </w:rPr>
         <w:t xml:space="preserve"> Автоматическая проверка плана на соответствие критериям ФГОС с индикацией статуса.</w:t>
@@ -1864,13 +1783,8 @@
       <w:r>
         <w:rPr>
           <w:rFonts w:ascii="Times New Roman" w:hAnsi="Times New Roman"/>
-          <w:sz w:val="28"/>
-        </w:rPr>
-      </w:r>
-      <w:r>
-        <w:rPr>
-          <w:rFonts w:ascii="Times New Roman" w:hAnsi="Times New Roman"/>
           <w:b/>
+          <w:i w:val="0"/>
           <w:sz w:val="28"/>
         </w:rPr>
         <w:t>ФТ-06 (Маршрут согласования):</w:t>
@@ -1878,6 +1792,8 @@
       <w:r>
         <w:rPr>
           <w:rFonts w:ascii="Times New Roman" w:hAnsi="Times New Roman"/>
+          <w:b w:val="0"/>
+          <w:i w:val="0"/>
           <w:sz w:val="28"/>
         </w:rPr>
         <w:t xml:space="preserve"> Фиксация шагов визирования УП, ФИО подписантов, дат, статусов и криптографических хэшей подписей.</w:t>
@@ -1900,13 +1816,8 @@
       <w:r>
         <w:rPr>
           <w:rFonts w:ascii="Times New Roman" w:hAnsi="Times New Roman"/>
-          <w:sz w:val="28"/>
-        </w:rPr>
-      </w:r>
-      <w:r>
-        <w:rPr>
-          <w:rFonts w:ascii="Times New Roman" w:hAnsi="Times New Roman"/>
           <w:b/>
+          <w:i w:val="0"/>
           <w:sz w:val="28"/>
         </w:rPr>
         <w:t>ФТ-07 (Служебные записки):</w:t>
@@ -1914,6 +1825,8 @@
       <w:r>
         <w:rPr>
           <w:rFonts w:ascii="Times New Roman" w:hAnsi="Times New Roman"/>
+          <w:b w:val="0"/>
+          <w:i w:val="0"/>
           <w:sz w:val="28"/>
         </w:rPr>
         <w:t xml:space="preserve"> Формирование СЗ с фиксацией выпускающей и реализующей кафедр, текстового обоснования и дифференциальных изменений дисциплин.</w:t>
@@ -1936,13 +1849,8 @@
       <w:r>
         <w:rPr>
           <w:rFonts w:ascii="Times New Roman" w:hAnsi="Times New Roman"/>
-          <w:sz w:val="28"/>
-        </w:rPr>
-      </w:r>
-      <w:r>
-        <w:rPr>
-          <w:rFonts w:ascii="Times New Roman" w:hAnsi="Times New Roman"/>
           <w:b/>
+          <w:i w:val="0"/>
           <w:sz w:val="28"/>
         </w:rPr>
         <w:t>ФТ-08 (Матрица компетенций):</w:t>
@@ -1950,6 +1858,8 @@
       <w:r>
         <w:rPr>
           <w:rFonts w:ascii="Times New Roman" w:hAnsi="Times New Roman"/>
+          <w:b w:val="0"/>
+          <w:i w:val="0"/>
           <w:sz w:val="28"/>
         </w:rPr>
         <w:t xml:space="preserve"> Хранение и отображение категорий компетенций (УК, ОПК, ПК), их формулировок и дескрипторов.</w:t>
@@ -1972,13 +1882,8 @@
       <w:r>
         <w:rPr>
           <w:rFonts w:ascii="Times New Roman" w:hAnsi="Times New Roman"/>
-          <w:sz w:val="28"/>
-        </w:rPr>
-      </w:r>
-      <w:r>
-        <w:rPr>
-          <w:rFonts w:ascii="Times New Roman" w:hAnsi="Times New Roman"/>
           <w:b/>
+          <w:i w:val="0"/>
           <w:sz w:val="28"/>
         </w:rPr>
         <w:t>ФТ-09 (Справочник кафедр):</w:t>
@@ -1986,6 +1891,8 @@
       <w:r>
         <w:rPr>
           <w:rFonts w:ascii="Times New Roman" w:hAnsi="Times New Roman"/>
+          <w:b w:val="0"/>
+          <w:i w:val="0"/>
           <w:sz w:val="28"/>
         </w:rPr>
         <w:t xml:space="preserve"> Ведение структуры подразделений с разделением на выпускающие, реализующие, экспертные и руководящие.</w:t>
@@ -2008,13 +1915,8 @@
       <w:r>
         <w:rPr>
           <w:rFonts w:ascii="Times New Roman" w:hAnsi="Times New Roman"/>
-          <w:sz w:val="28"/>
-        </w:rPr>
-      </w:r>
-      <w:r>
-        <w:rPr>
-          <w:rFonts w:ascii="Times New Roman" w:hAnsi="Times New Roman"/>
           <w:b/>
+          <w:i w:val="0"/>
           <w:sz w:val="28"/>
         </w:rPr>
         <w:t>ФТ-10 (Объявления):</w:t>
@@ -2022,6 +1924,8 @@
       <w:r>
         <w:rPr>
           <w:rFonts w:ascii="Times New Roman" w:hAnsi="Times New Roman"/>
+          <w:b w:val="0"/>
+          <w:i w:val="0"/>
           <w:sz w:val="28"/>
         </w:rPr>
         <w:t xml:space="preserve"> Публикация регламентов и объявлений с поддержкой закрепления важных записей.</w:t>
@@ -2044,13 +1948,8 @@
       <w:r>
         <w:rPr>
           <w:rFonts w:ascii="Times New Roman" w:hAnsi="Times New Roman"/>
-          <w:sz w:val="28"/>
-        </w:rPr>
-      </w:r>
-      <w:r>
-        <w:rPr>
-          <w:rFonts w:ascii="Times New Roman" w:hAnsi="Times New Roman"/>
           <w:b/>
+          <w:i w:val="0"/>
           <w:sz w:val="28"/>
         </w:rPr>
         <w:t>ФТ-11 (Журнал аудита):</w:t>
@@ -2058,6 +1957,8 @@
       <w:r>
         <w:rPr>
           <w:rFonts w:ascii="Times New Roman" w:hAnsi="Times New Roman"/>
+          <w:b w:val="0"/>
+          <w:i w:val="0"/>
           <w:sz w:val="28"/>
         </w:rPr>
         <w:t xml:space="preserve"> Протоколирование всех операций (время, пользователь, роль, действие, объект, статус, IP-адрес).</w:t>
@@ -2080,13 +1981,8 @@
       <w:r>
         <w:rPr>
           <w:rFonts w:ascii="Times New Roman" w:hAnsi="Times New Roman"/>
-          <w:sz w:val="28"/>
-        </w:rPr>
-      </w:r>
-      <w:r>
-        <w:rPr>
-          <w:rFonts w:ascii="Times New Roman" w:hAnsi="Times New Roman"/>
           <w:b/>
+          <w:i w:val="0"/>
           <w:sz w:val="28"/>
         </w:rPr>
         <w:t>ФТ-12 (Карта сайта):</w:t>
@@ -2094,6 +1990,8 @@
       <w:r>
         <w:rPr>
           <w:rFonts w:ascii="Times New Roman" w:hAnsi="Times New Roman"/>
+          <w:b w:val="0"/>
+          <w:i w:val="0"/>
           <w:sz w:val="28"/>
         </w:rPr>
         <w:t xml:space="preserve"> Наличие интерактивной карты сайта со всеми разделами системы.</w:t>
@@ -2130,13 +2028,8 @@
       <w:r>
         <w:rPr>
           <w:rFonts w:ascii="Times New Roman" w:hAnsi="Times New Roman"/>
-          <w:sz w:val="28"/>
-        </w:rPr>
-      </w:r>
-      <w:r>
-        <w:rPr>
-          <w:rFonts w:ascii="Times New Roman" w:hAnsi="Times New Roman"/>
           <w:b/>
+          <w:i w:val="0"/>
           <w:sz w:val="28"/>
         </w:rPr>
         <w:t>НФТ-01 (Производительность):</w:t>
@@ -2144,6 +2037,8 @@
       <w:r>
         <w:rPr>
           <w:rFonts w:ascii="Times New Roman" w:hAnsi="Times New Roman"/>
+          <w:b w:val="0"/>
+          <w:i w:val="0"/>
           <w:sz w:val="28"/>
         </w:rPr>
         <w:t xml:space="preserve"> Время отклика сервера при формировании страниц не должно превышать 200 мс при стандартной нагрузке.</w:t>
@@ -2166,13 +2061,8 @@
       <w:r>
         <w:rPr>
           <w:rFonts w:ascii="Times New Roman" w:hAnsi="Times New Roman"/>
-          <w:sz w:val="28"/>
-        </w:rPr>
-      </w:r>
-      <w:r>
-        <w:rPr>
-          <w:rFonts w:ascii="Times New Roman" w:hAnsi="Times New Roman"/>
           <w:b/>
+          <w:i w:val="0"/>
           <w:sz w:val="28"/>
         </w:rPr>
         <w:t>НФТ-02 (Надежность и транзакционность):</w:t>
@@ -2180,9 +2070,29 @@
       <w:r>
         <w:rPr>
           <w:rFonts w:ascii="Times New Roman" w:hAnsi="Times New Roman"/>
+          <w:b w:val="0"/>
+          <w:i w:val="0"/>
           <w:sz w:val="28"/>
         </w:rPr>
-        <w:t xml:space="preserve"> Целостность данных обеспечивается связями первичных и внешних ключей (`Foreign Keys`).</w:t>
+        <w:t xml:space="preserve"> Целостность данных обеспечивается связями первичных и внешних ключей (</w:t>
+      </w:r>
+      <w:r>
+        <w:rPr>
+          <w:rFonts w:ascii="Courier New" w:hAnsi="Courier New"/>
+          <w:b w:val="0"/>
+          <w:i w:val="0"/>
+          <w:sz w:val="28"/>
+        </w:rPr>
+        <w:t>Foreign Keys</w:t>
+      </w:r>
+      <w:r>
+        <w:rPr>
+          <w:rFonts w:ascii="Times New Roman" w:hAnsi="Times New Roman"/>
+          <w:b w:val="0"/>
+          <w:i w:val="0"/>
+          <w:sz w:val="28"/>
+        </w:rPr>
+        <w:t>).</w:t>
       </w:r>
     </w:p>
     <w:p>
@@ -2202,13 +2112,8 @@
       <w:r>
         <w:rPr>
           <w:rFonts w:ascii="Times New Roman" w:hAnsi="Times New Roman"/>
-          <w:sz w:val="28"/>
-        </w:rPr>
-      </w:r>
-      <w:r>
-        <w:rPr>
-          <w:rFonts w:ascii="Times New Roman" w:hAnsi="Times New Roman"/>
           <w:b/>
+          <w:i w:val="0"/>
           <w:sz w:val="28"/>
         </w:rPr>
         <w:t>НФТ-03 (Безопасность):</w:t>
@@ -2216,9 +2121,47 @@
       <w:r>
         <w:rPr>
           <w:rFonts w:ascii="Times New Roman" w:hAnsi="Times New Roman"/>
+          <w:b w:val="0"/>
+          <w:i w:val="0"/>
           <w:sz w:val="28"/>
         </w:rPr>
-        <w:t xml:space="preserve"> Использование подготовленных запросов (`Prepared Statements`) для исключения SQL-инъекций; экранирование вывода HTML (`htmlspecialchars`) для защиты от XSS.</w:t>
+        <w:t xml:space="preserve"> Использование подготовленных запросов (</w:t>
+      </w:r>
+      <w:r>
+        <w:rPr>
+          <w:rFonts w:ascii="Courier New" w:hAnsi="Courier New"/>
+          <w:b w:val="0"/>
+          <w:i w:val="0"/>
+          <w:sz w:val="28"/>
+        </w:rPr>
+        <w:t>Prepared Statements</w:t>
+      </w:r>
+      <w:r>
+        <w:rPr>
+          <w:rFonts w:ascii="Times New Roman" w:hAnsi="Times New Roman"/>
+          <w:b w:val="0"/>
+          <w:i w:val="0"/>
+          <w:sz w:val="28"/>
+        </w:rPr>
+        <w:t>) для исключения SQL-инъекций; экранирование вывода HTML (</w:t>
+      </w:r>
+      <w:r>
+        <w:rPr>
+          <w:rFonts w:ascii="Courier New" w:hAnsi="Courier New"/>
+          <w:b w:val="0"/>
+          <w:i w:val="0"/>
+          <w:sz w:val="28"/>
+        </w:rPr>
+        <w:t>htmlspecialchars</w:t>
+      </w:r>
+      <w:r>
+        <w:rPr>
+          <w:rFonts w:ascii="Times New Roman" w:hAnsi="Times New Roman"/>
+          <w:b w:val="0"/>
+          <w:i w:val="0"/>
+          <w:sz w:val="28"/>
+        </w:rPr>
+        <w:t>) для защиты от XSS.</w:t>
       </w:r>
     </w:p>
     <w:p>
@@ -2238,13 +2181,8 @@
       <w:r>
         <w:rPr>
           <w:rFonts w:ascii="Times New Roman" w:hAnsi="Times New Roman"/>
-          <w:sz w:val="28"/>
-        </w:rPr>
-      </w:r>
-      <w:r>
-        <w:rPr>
-          <w:rFonts w:ascii="Times New Roman" w:hAnsi="Times New Roman"/>
           <w:b/>
+          <w:i w:val="0"/>
           <w:sz w:val="28"/>
         </w:rPr>
         <w:t>НФТ-04 (Кроссплатформенность и переносимость):</w:t>
@@ -2252,6 +2190,8 @@
       <w:r>
         <w:rPr>
           <w:rFonts w:ascii="Times New Roman" w:hAnsi="Times New Roman"/>
+          <w:b w:val="0"/>
+          <w:i w:val="0"/>
           <w:sz w:val="28"/>
         </w:rPr>
         <w:t xml:space="preserve"> Возможность автономного развертывания как на стеке PHP/MySQL, так и на легковесном стеке Python/SQLite без внешних закрытых зависимостей.</w:t>
@@ -2274,13 +2214,8 @@
       <w:r>
         <w:rPr>
           <w:rFonts w:ascii="Times New Roman" w:hAnsi="Times New Roman"/>
-          <w:sz w:val="28"/>
-        </w:rPr>
-      </w:r>
-      <w:r>
-        <w:rPr>
-          <w:rFonts w:ascii="Times New Roman" w:hAnsi="Times New Roman"/>
           <w:b/>
+          <w:i w:val="0"/>
           <w:sz w:val="28"/>
         </w:rPr>
         <w:t>НФТ-05 (Адаптивность):</w:t>
@@ -2288,6 +2223,8 @@
       <w:r>
         <w:rPr>
           <w:rFonts w:ascii="Times New Roman" w:hAnsi="Times New Roman"/>
+          <w:b w:val="0"/>
+          <w:i w:val="0"/>
           <w:sz w:val="28"/>
         </w:rPr>
         <w:t xml:space="preserve"> Корректное отображение на мониторах ПК, планшетах и мобильных устройствах.</w:t>
@@ -2310,13 +2247,8 @@
       <w:r>
         <w:rPr>
           <w:rFonts w:ascii="Times New Roman" w:hAnsi="Times New Roman"/>
-          <w:sz w:val="28"/>
-        </w:rPr>
-      </w:r>
-      <w:r>
-        <w:rPr>
-          <w:rFonts w:ascii="Times New Roman" w:hAnsi="Times New Roman"/>
           <w:b/>
+          <w:i w:val="0"/>
           <w:sz w:val="28"/>
         </w:rPr>
         <w:t>НФТ-06 (Эргономика):</w:t>
@@ -2324,6 +2256,8 @@
       <w:r>
         <w:rPr>
           <w:rFonts w:ascii="Times New Roman" w:hAnsi="Times New Roman"/>
+          <w:b w:val="0"/>
+          <w:i w:val="0"/>
           <w:sz w:val="28"/>
         </w:rPr>
         <w:t xml:space="preserve"> Единый строгий корпоративный стиль оформления с визуальным цветовым кодированием статусов документов.</w:t>
@@ -2352,6 +2286,8 @@
       <w:r>
         <w:rPr>
           <w:rFonts w:ascii="Times New Roman" w:hAnsi="Times New Roman"/>
+          <w:b w:val="0"/>
+          <w:i w:val="0"/>
           <w:sz w:val="28"/>
         </w:rPr>
         <w:t>В соответствии с заданием выполнен сравнительный анализ бесплатных инструментальных платформ с открытым исходным кодом, поддерживающих PHP и реляционные СУБД MySQL / MariaDB / SQLite.</w:t>
@@ -2414,6 +2350,7 @@
               <w:rPr>
                 <w:rFonts w:ascii="Times New Roman" w:hAnsi="Times New Roman"/>
                 <w:b/>
+                <w:i w:val="0"/>
                 <w:sz w:val="22"/>
               </w:rPr>
               <w:t>Критерий сравнения</w:t>
@@ -2440,6 +2377,7 @@
               <w:rPr>
                 <w:rFonts w:ascii="Times New Roman" w:hAnsi="Times New Roman"/>
                 <w:b/>
+                <w:i w:val="0"/>
                 <w:sz w:val="22"/>
               </w:rPr>
               <w:t>Drupal</w:t>
@@ -2466,6 +2404,7 @@
               <w:rPr>
                 <w:rFonts w:ascii="Times New Roman" w:hAnsi="Times New Roman"/>
                 <w:b/>
+                <w:i w:val="0"/>
                 <w:sz w:val="22"/>
               </w:rPr>
               <w:t>Joomla</w:t>
@@ -2492,6 +2431,7 @@
               <w:rPr>
                 <w:rFonts w:ascii="Times New Roman" w:hAnsi="Times New Roman"/>
                 <w:b/>
+                <w:i w:val="0"/>
                 <w:sz w:val="22"/>
               </w:rPr>
               <w:t>Laravel</w:t>
@@ -2518,6 +2458,7 @@
               <w:rPr>
                 <w:rFonts w:ascii="Times New Roman" w:hAnsi="Times New Roman"/>
                 <w:b/>
+                <w:i w:val="0"/>
                 <w:sz w:val="22"/>
               </w:rPr>
               <w:t>Native PHP + PDO / Light Server</w:t>
@@ -2544,22 +2485,11 @@
             <w:r>
               <w:rPr>
                 <w:rFonts w:ascii="Times New Roman" w:hAnsi="Times New Roman"/>
-                <w:sz w:val="22"/>
-              </w:rPr>
-            </w:r>
-            <w:r>
-              <w:rPr>
-                <w:rFonts w:ascii="Times New Roman" w:hAnsi="Times New Roman"/>
                 <w:b/>
+                <w:i w:val="0"/>
                 <w:sz w:val="22"/>
               </w:rPr>
               <w:t>Лицензия и стоимость</w:t>
-            </w:r>
-            <w:r>
-              <w:rPr>
-                <w:rFonts w:ascii="Times New Roman" w:hAnsi="Times New Roman"/>
-                <w:sz w:val="22"/>
-              </w:rPr>
             </w:r>
           </w:p>
         </w:tc>
@@ -2581,6 +2511,8 @@
             <w:r>
               <w:rPr>
                 <w:rFonts w:ascii="Times New Roman" w:hAnsi="Times New Roman"/>
+                <w:b w:val="0"/>
+                <w:i w:val="0"/>
                 <w:sz w:val="22"/>
               </w:rPr>
               <w:t>Бесплатно (GPL)</w:t>
@@ -2605,6 +2537,8 @@
             <w:r>
               <w:rPr>
                 <w:rFonts w:ascii="Times New Roman" w:hAnsi="Times New Roman"/>
+                <w:b w:val="0"/>
+                <w:i w:val="0"/>
                 <w:sz w:val="22"/>
               </w:rPr>
               <w:t>Бесплатно (GPL)</w:t>
@@ -2629,6 +2563,8 @@
             <w:r>
               <w:rPr>
                 <w:rFonts w:ascii="Times New Roman" w:hAnsi="Times New Roman"/>
+                <w:b w:val="0"/>
+                <w:i w:val="0"/>
                 <w:sz w:val="22"/>
               </w:rPr>
               <w:t>Бесплатно (MIT)</w:t>
@@ -2653,6 +2589,8 @@
             <w:r>
               <w:rPr>
                 <w:rFonts w:ascii="Times New Roman" w:hAnsi="Times New Roman"/>
+                <w:b w:val="0"/>
+                <w:i w:val="0"/>
                 <w:sz w:val="22"/>
               </w:rPr>
               <w:t>Бесплатно (Open Source)</w:t>
@@ -2679,22 +2617,11 @@
             <w:r>
               <w:rPr>
                 <w:rFonts w:ascii="Times New Roman" w:hAnsi="Times New Roman"/>
-                <w:sz w:val="22"/>
-              </w:rPr>
-            </w:r>
-            <w:r>
-              <w:rPr>
-                <w:rFonts w:ascii="Times New Roman" w:hAnsi="Times New Roman"/>
                 <w:b/>
+                <w:i w:val="0"/>
                 <w:sz w:val="22"/>
               </w:rPr>
               <w:t>Язык разработки</w:t>
-            </w:r>
-            <w:r>
-              <w:rPr>
-                <w:rFonts w:ascii="Times New Roman" w:hAnsi="Times New Roman"/>
-                <w:sz w:val="22"/>
-              </w:rPr>
             </w:r>
           </w:p>
         </w:tc>
@@ -2716,6 +2643,8 @@
             <w:r>
               <w:rPr>
                 <w:rFonts w:ascii="Times New Roman" w:hAnsi="Times New Roman"/>
+                <w:b w:val="0"/>
+                <w:i w:val="0"/>
                 <w:sz w:val="22"/>
               </w:rPr>
               <w:t>PHP 8.x</w:t>
@@ -2740,6 +2669,8 @@
             <w:r>
               <w:rPr>
                 <w:rFonts w:ascii="Times New Roman" w:hAnsi="Times New Roman"/>
+                <w:b w:val="0"/>
+                <w:i w:val="0"/>
                 <w:sz w:val="22"/>
               </w:rPr>
               <w:t>PHP 8.x</w:t>
@@ -2764,6 +2695,8 @@
             <w:r>
               <w:rPr>
                 <w:rFonts w:ascii="Times New Roman" w:hAnsi="Times New Roman"/>
+                <w:b w:val="0"/>
+                <w:i w:val="0"/>
                 <w:sz w:val="22"/>
               </w:rPr>
               <w:t>PHP 8.x</w:t>
@@ -2788,6 +2721,8 @@
             <w:r>
               <w:rPr>
                 <w:rFonts w:ascii="Times New Roman" w:hAnsi="Times New Roman"/>
+                <w:b w:val="0"/>
+                <w:i w:val="0"/>
                 <w:sz w:val="22"/>
               </w:rPr>
               <w:t>PHP 8.x / Python 3.x</w:t>
@@ -2814,22 +2749,11 @@
             <w:r>
               <w:rPr>
                 <w:rFonts w:ascii="Times New Roman" w:hAnsi="Times New Roman"/>
-                <w:sz w:val="22"/>
-              </w:rPr>
-            </w:r>
-            <w:r>
-              <w:rPr>
-                <w:rFonts w:ascii="Times New Roman" w:hAnsi="Times New Roman"/>
                 <w:b/>
+                <w:i w:val="0"/>
                 <w:sz w:val="22"/>
               </w:rPr>
               <w:t>Поддерживаемые СУБД</w:t>
-            </w:r>
-            <w:r>
-              <w:rPr>
-                <w:rFonts w:ascii="Times New Roman" w:hAnsi="Times New Roman"/>
-                <w:sz w:val="22"/>
-              </w:rPr>
             </w:r>
           </w:p>
         </w:tc>
@@ -2851,6 +2775,8 @@
             <w:r>
               <w:rPr>
                 <w:rFonts w:ascii="Times New Roman" w:hAnsi="Times New Roman"/>
+                <w:b w:val="0"/>
+                <w:i w:val="0"/>
                 <w:sz w:val="22"/>
               </w:rPr>
               <w:t>MySQL, MariaDB, PostgreSQL</w:t>
@@ -2875,6 +2801,8 @@
             <w:r>
               <w:rPr>
                 <w:rFonts w:ascii="Times New Roman" w:hAnsi="Times New Roman"/>
+                <w:b w:val="0"/>
+                <w:i w:val="0"/>
                 <w:sz w:val="22"/>
               </w:rPr>
               <w:t>MySQL, MariaDB</w:t>
@@ -2899,6 +2827,8 @@
             <w:r>
               <w:rPr>
                 <w:rFonts w:ascii="Times New Roman" w:hAnsi="Times New Roman"/>
+                <w:b w:val="0"/>
+                <w:i w:val="0"/>
                 <w:sz w:val="22"/>
               </w:rPr>
               <w:t>MySQL, PostgreSQL, SQLite</w:t>
@@ -2923,6 +2853,8 @@
             <w:r>
               <w:rPr>
                 <w:rFonts w:ascii="Times New Roman" w:hAnsi="Times New Roman"/>
+                <w:b w:val="0"/>
+                <w:i w:val="0"/>
                 <w:sz w:val="22"/>
               </w:rPr>
               <w:t>MySQL, MariaDB, SQLite</w:t>
@@ -2949,22 +2881,11 @@
             <w:r>
               <w:rPr>
                 <w:rFonts w:ascii="Times New Roman" w:hAnsi="Times New Roman"/>
-                <w:sz w:val="22"/>
-              </w:rPr>
-            </w:r>
-            <w:r>
-              <w:rPr>
-                <w:rFonts w:ascii="Times New Roman" w:hAnsi="Times New Roman"/>
                 <w:b/>
+                <w:i w:val="0"/>
                 <w:sz w:val="22"/>
               </w:rPr>
               <w:t>Требования к ресурсам</w:t>
-            </w:r>
-            <w:r>
-              <w:rPr>
-                <w:rFonts w:ascii="Times New Roman" w:hAnsi="Times New Roman"/>
-                <w:sz w:val="22"/>
-              </w:rPr>
             </w:r>
           </w:p>
         </w:tc>
@@ -2986,9 +2907,11 @@
             <w:r>
               <w:rPr>
                 <w:rFonts w:ascii="Times New Roman" w:hAnsi="Times New Roman"/>
+                <w:b w:val="0"/>
+                <w:i w:val="0"/>
                 <w:sz w:val="22"/>
               </w:rPr>
-              <w:t>Высокие ($\ge 256$ MB RAM)</w:t>
+              <w:t>Высокие (≥ 256 MB RAM)</w:t>
             </w:r>
           </w:p>
         </w:tc>
@@ -3010,9 +2933,11 @@
             <w:r>
               <w:rPr>
                 <w:rFonts w:ascii="Times New Roman" w:hAnsi="Times New Roman"/>
+                <w:b w:val="0"/>
+                <w:i w:val="0"/>
                 <w:sz w:val="22"/>
               </w:rPr>
-              <w:t>Средние ($\ge 128$ MB RAM)</w:t>
+              <w:t>Средние (≥ 128 MB RAM)</w:t>
             </w:r>
           </w:p>
         </w:tc>
@@ -3034,9 +2959,11 @@
             <w:r>
               <w:rPr>
                 <w:rFonts w:ascii="Times New Roman" w:hAnsi="Times New Roman"/>
+                <w:b w:val="0"/>
+                <w:i w:val="0"/>
                 <w:sz w:val="22"/>
               </w:rPr>
-              <w:t>Средние ($\ge 128$ MB RAM)</w:t>
+              <w:t>Средние (≥ 128 MB RAM)</w:t>
             </w:r>
           </w:p>
         </w:tc>
@@ -3058,9 +2985,11 @@
             <w:r>
               <w:rPr>
                 <w:rFonts w:ascii="Times New Roman" w:hAnsi="Times New Roman"/>
+                <w:b w:val="0"/>
+                <w:i w:val="0"/>
                 <w:sz w:val="22"/>
               </w:rPr>
-              <w:t>Минимальные ($&lt; 32$ MB RAM)</w:t>
+              <w:t>Минимальные (&lt; 32 MB RAM)</w:t>
             </w:r>
           </w:p>
         </w:tc>
@@ -3084,22 +3013,11 @@
             <w:r>
               <w:rPr>
                 <w:rFonts w:ascii="Times New Roman" w:hAnsi="Times New Roman"/>
-                <w:sz w:val="22"/>
-              </w:rPr>
-            </w:r>
-            <w:r>
-              <w:rPr>
-                <w:rFonts w:ascii="Times New Roman" w:hAnsi="Times New Roman"/>
                 <w:b/>
+                <w:i w:val="0"/>
                 <w:sz w:val="22"/>
               </w:rPr>
               <w:t>Сложность развертывания</w:t>
-            </w:r>
-            <w:r>
-              <w:rPr>
-                <w:rFonts w:ascii="Times New Roman" w:hAnsi="Times New Roman"/>
-                <w:sz w:val="22"/>
-              </w:rPr>
             </w:r>
           </w:p>
         </w:tc>
@@ -3121,6 +3039,8 @@
             <w:r>
               <w:rPr>
                 <w:rFonts w:ascii="Times New Roman" w:hAnsi="Times New Roman"/>
+                <w:b w:val="0"/>
+                <w:i w:val="0"/>
                 <w:sz w:val="22"/>
               </w:rPr>
               <w:t>Высокая (Composer, Drush, Nginx)</w:t>
@@ -3145,6 +3065,8 @@
             <w:r>
               <w:rPr>
                 <w:rFonts w:ascii="Times New Roman" w:hAnsi="Times New Roman"/>
+                <w:b w:val="0"/>
+                <w:i w:val="0"/>
                 <w:sz w:val="22"/>
               </w:rPr>
               <w:t>Средняя (инсталлятор)</w:t>
@@ -3169,6 +3091,8 @@
             <w:r>
               <w:rPr>
                 <w:rFonts w:ascii="Times New Roman" w:hAnsi="Times New Roman"/>
+                <w:b w:val="0"/>
+                <w:i w:val="0"/>
                 <w:sz w:val="22"/>
               </w:rPr>
               <w:t>Высокая (Composer, Artisan, Node)</w:t>
@@ -3193,6 +3117,8 @@
             <w:r>
               <w:rPr>
                 <w:rFonts w:ascii="Times New Roman" w:hAnsi="Times New Roman"/>
+                <w:b w:val="0"/>
+                <w:i w:val="0"/>
                 <w:sz w:val="22"/>
               </w:rPr>
               <w:t>Нулевая (запуск одной командой)</w:t>
@@ -3219,22 +3145,11 @@
             <w:r>
               <w:rPr>
                 <w:rFonts w:ascii="Times New Roman" w:hAnsi="Times New Roman"/>
-                <w:sz w:val="22"/>
-              </w:rPr>
-            </w:r>
-            <w:r>
-              <w:rPr>
-                <w:rFonts w:ascii="Times New Roman" w:hAnsi="Times New Roman"/>
                 <w:b/>
+                <w:i w:val="0"/>
                 <w:sz w:val="22"/>
               </w:rPr>
               <w:t>Кастомизация структур данных</w:t>
-            </w:r>
-            <w:r>
-              <w:rPr>
-                <w:rFonts w:ascii="Times New Roman" w:hAnsi="Times New Roman"/>
-                <w:sz w:val="22"/>
-              </w:rPr>
             </w:r>
           </w:p>
         </w:tc>
@@ -3256,6 +3171,8 @@
             <w:r>
               <w:rPr>
                 <w:rFonts w:ascii="Times New Roman" w:hAnsi="Times New Roman"/>
+                <w:b w:val="0"/>
+                <w:i w:val="0"/>
                 <w:sz w:val="22"/>
               </w:rPr>
               <w:t>Модули CCK/Fields</w:t>
@@ -3280,6 +3197,8 @@
             <w:r>
               <w:rPr>
                 <w:rFonts w:ascii="Times New Roman" w:hAnsi="Times New Roman"/>
+                <w:b w:val="0"/>
+                <w:i w:val="0"/>
                 <w:sz w:val="22"/>
               </w:rPr>
               <w:t>Расширения компонентов</w:t>
@@ -3304,6 +3223,8 @@
             <w:r>
               <w:rPr>
                 <w:rFonts w:ascii="Times New Roman" w:hAnsi="Times New Roman"/>
+                <w:b w:val="0"/>
+                <w:i w:val="0"/>
                 <w:sz w:val="22"/>
               </w:rPr>
               <w:t>Eloquent ORM / миграции</w:t>
@@ -3328,6 +3249,8 @@
             <w:r>
               <w:rPr>
                 <w:rFonts w:ascii="Times New Roman" w:hAnsi="Times New Roman"/>
+                <w:b w:val="0"/>
+                <w:i w:val="0"/>
                 <w:sz w:val="22"/>
               </w:rPr>
               <w:t>Прямой SQL DDL / DML</w:t>
@@ -3354,22 +3277,11 @@
             <w:r>
               <w:rPr>
                 <w:rFonts w:ascii="Times New Roman" w:hAnsi="Times New Roman"/>
-                <w:sz w:val="22"/>
-              </w:rPr>
-            </w:r>
-            <w:r>
-              <w:rPr>
-                <w:rFonts w:ascii="Times New Roman" w:hAnsi="Times New Roman"/>
                 <w:b/>
+                <w:i w:val="0"/>
                 <w:sz w:val="22"/>
               </w:rPr>
               <w:t>Прозрачность архитектуры</w:t>
-            </w:r>
-            <w:r>
-              <w:rPr>
-                <w:rFonts w:ascii="Times New Roman" w:hAnsi="Times New Roman"/>
-                <w:sz w:val="22"/>
-              </w:rPr>
             </w:r>
           </w:p>
         </w:tc>
@@ -3391,6 +3303,8 @@
             <w:r>
               <w:rPr>
                 <w:rFonts w:ascii="Times New Roman" w:hAnsi="Times New Roman"/>
+                <w:b w:val="0"/>
+                <w:i w:val="0"/>
                 <w:sz w:val="22"/>
               </w:rPr>
               <w:t>Избыточна для прототипа</w:t>
@@ -3415,6 +3329,8 @@
             <w:r>
               <w:rPr>
                 <w:rFonts w:ascii="Times New Roman" w:hAnsi="Times New Roman"/>
+                <w:b w:val="0"/>
+                <w:i w:val="0"/>
                 <w:sz w:val="22"/>
               </w:rPr>
               <w:t>Избыточна для прототипа</w:t>
@@ -3439,6 +3355,8 @@
             <w:r>
               <w:rPr>
                 <w:rFonts w:ascii="Times New Roman" w:hAnsi="Times New Roman"/>
+                <w:b w:val="0"/>
+                <w:i w:val="0"/>
                 <w:sz w:val="22"/>
               </w:rPr>
               <w:t>Скрыта за абстракциями</w:t>
@@ -3463,6 +3381,8 @@
             <w:r>
               <w:rPr>
                 <w:rFonts w:ascii="Times New Roman" w:hAnsi="Times New Roman"/>
+                <w:b w:val="0"/>
+                <w:i w:val="0"/>
                 <w:sz w:val="22"/>
               </w:rPr>
               <w:t>100% прозрачность для учебного анализа</w:t>
@@ -3489,22 +3409,11 @@
             <w:r>
               <w:rPr>
                 <w:rFonts w:ascii="Times New Roman" w:hAnsi="Times New Roman"/>
-                <w:sz w:val="22"/>
-              </w:rPr>
-            </w:r>
-            <w:r>
-              <w:rPr>
-                <w:rFonts w:ascii="Times New Roman" w:hAnsi="Times New Roman"/>
                 <w:b/>
+                <w:i w:val="0"/>
                 <w:sz w:val="22"/>
               </w:rPr>
               <w:t>Безопасность запросов</w:t>
-            </w:r>
-            <w:r>
-              <w:rPr>
-                <w:rFonts w:ascii="Times New Roman" w:hAnsi="Times New Roman"/>
-                <w:sz w:val="22"/>
-              </w:rPr>
             </w:r>
           </w:p>
         </w:tc>
@@ -3526,6 +3435,8 @@
             <w:r>
               <w:rPr>
                 <w:rFonts w:ascii="Times New Roman" w:hAnsi="Times New Roman"/>
+                <w:b w:val="0"/>
+                <w:i w:val="0"/>
                 <w:sz w:val="22"/>
               </w:rPr>
               <w:t>Встроенный API</w:t>
@@ -3550,6 +3461,8 @@
             <w:r>
               <w:rPr>
                 <w:rFonts w:ascii="Times New Roman" w:hAnsi="Times New Roman"/>
+                <w:b w:val="0"/>
+                <w:i w:val="0"/>
                 <w:sz w:val="22"/>
               </w:rPr>
               <w:t>Встроенный API</w:t>
@@ -3574,6 +3487,8 @@
             <w:r>
               <w:rPr>
                 <w:rFonts w:ascii="Times New Roman" w:hAnsi="Times New Roman"/>
+                <w:b w:val="0"/>
+                <w:i w:val="0"/>
                 <w:sz w:val="22"/>
               </w:rPr>
               <w:t>Query Builder</w:t>
@@ -3598,6 +3513,8 @@
             <w:r>
               <w:rPr>
                 <w:rFonts w:ascii="Times New Roman" w:hAnsi="Times New Roman"/>
+                <w:b w:val="0"/>
+                <w:i w:val="0"/>
                 <w:sz w:val="22"/>
               </w:rPr>
               <w:t>PDO Prepared Statements</w:t>
@@ -3634,6 +3551,8 @@
       <w:r>
         <w:rPr>
           <w:rFonts w:ascii="Times New Roman" w:hAnsi="Times New Roman"/>
+          <w:b w:val="0"/>
+          <w:i w:val="0"/>
           <w:sz w:val="28"/>
         </w:rPr>
         <w:t xml:space="preserve">Для учебного корпоративного портала Центра АНОК выбран </w:t>
@@ -3642,6 +3561,7 @@
         <w:rPr>
           <w:rFonts w:ascii="Times New Roman" w:hAnsi="Times New Roman"/>
           <w:b/>
+          <w:i w:val="0"/>
           <w:sz w:val="28"/>
         </w:rPr>
         <w:t>нативный стек PHP / Python с PDO / SQLite / MySQL</w:t>
@@ -3649,6 +3569,8 @@
       <w:r>
         <w:rPr>
           <w:rFonts w:ascii="Times New Roman" w:hAnsi="Times New Roman"/>
+          <w:b w:val="0"/>
+          <w:i w:val="0"/>
           <w:sz w:val="28"/>
         </w:rPr>
         <w:t>. Данный выбор обоснован следующими факторами:</w:t>
@@ -3671,13 +3593,8 @@
       <w:r>
         <w:rPr>
           <w:rFonts w:ascii="Times New Roman" w:hAnsi="Times New Roman"/>
-          <w:sz w:val="28"/>
-        </w:rPr>
-      </w:r>
-      <w:r>
-        <w:rPr>
-          <w:rFonts w:ascii="Times New Roman" w:hAnsi="Times New Roman"/>
           <w:b/>
+          <w:i w:val="0"/>
           <w:sz w:val="28"/>
         </w:rPr>
         <w:t>Полное соответствие заданию:</w:t>
@@ -3685,6 +3602,8 @@
       <w:r>
         <w:rPr>
           <w:rFonts w:ascii="Times New Roman" w:hAnsi="Times New Roman"/>
+          <w:b w:val="0"/>
+          <w:i w:val="0"/>
           <w:sz w:val="28"/>
         </w:rPr>
         <w:t xml:space="preserve"> соблюдены все требования к бесплатному ПО, архитектуре PHP/Python, СУБД MySQL/MariaDB/SQLite.</w:t>
@@ -3707,13 +3626,8 @@
       <w:r>
         <w:rPr>
           <w:rFonts w:ascii="Times New Roman" w:hAnsi="Times New Roman"/>
-          <w:sz w:val="28"/>
-        </w:rPr>
-      </w:r>
-      <w:r>
-        <w:rPr>
-          <w:rFonts w:ascii="Times New Roman" w:hAnsi="Times New Roman"/>
           <w:b/>
+          <w:i w:val="0"/>
           <w:sz w:val="28"/>
         </w:rPr>
         <w:t>Прозрачность реализации:</w:t>
@@ -3721,6 +3635,8 @@
       <w:r>
         <w:rPr>
           <w:rFonts w:ascii="Times New Roman" w:hAnsi="Times New Roman"/>
+          <w:b w:val="0"/>
+          <w:i w:val="0"/>
           <w:sz w:val="28"/>
         </w:rPr>
         <w:t xml:space="preserve"> демонстрация непосредственной реляционной схемы данных (13 таблиц), маршрутизации страниц и выполнения подготовленных SQL-запросов без накладных расходов тяжеловесных CMS.</w:t>
@@ -3743,13 +3659,8 @@
       <w:r>
         <w:rPr>
           <w:rFonts w:ascii="Times New Roman" w:hAnsi="Times New Roman"/>
-          <w:sz w:val="28"/>
-        </w:rPr>
-      </w:r>
-      <w:r>
-        <w:rPr>
-          <w:rFonts w:ascii="Times New Roman" w:hAnsi="Times New Roman"/>
           <w:b/>
+          <w:i w:val="0"/>
           <w:sz w:val="28"/>
         </w:rPr>
         <w:t>Автономность и мобильность:</w:t>
@@ -3757,6 +3668,8 @@
       <w:r>
         <w:rPr>
           <w:rFonts w:ascii="Times New Roman" w:hAnsi="Times New Roman"/>
+          <w:b w:val="0"/>
+          <w:i w:val="0"/>
           <w:sz w:val="28"/>
         </w:rPr>
         <w:t xml:space="preserve"> возможность мгновенного запуска и демонстрации прототипа в изолированных средах и веб-песочницах без необходимости настройки сложной инфраструктуры.</w:t>
@@ -3785,6 +3698,8 @@
       <w:r>
         <w:rPr>
           <w:rFonts w:ascii="Times New Roman" w:hAnsi="Times New Roman"/>
+          <w:b w:val="0"/>
+          <w:i w:val="0"/>
           <w:sz w:val="28"/>
         </w:rPr>
         <w:t>В рамках лабораторной работы № 1 полностью исследована предметная область Центра АНОК университета, выделены 8 ролей пользователей, разработана диаграмма вариантов использования (Use Case), сформулированы 12 функциональных и 6 нефункциональных требований, проведен сравнительный анализ CMS/фреймворков и обоснован выбор стека разработки.</w:t>

</xml_diff>

<commit_message>
Fix page breaks in generated reports
Co-authored-by: arena-agent <297053741+arena-agent@users.noreply.github.com>
</commit_message>
<xml_diff>
--- a/reports/lab1/LR1_Report_Variant15.docx
+++ b/reports/lab1/LR1_Report_Variant15.docx
@@ -95,6 +95,9 @@
     </w:p>
     <w:p>
       <w:pPr>
+        <w:keepNext/>
+        <w:keepLines/>
+        <w:widowControl/>
         <w:spacing w:before="240" w:after="120"/>
         <w:jc w:val="left"/>
       </w:pPr>
@@ -109,6 +112,7 @@
     </w:p>
     <w:p>
       <w:pPr>
+        <w:widowControl/>
         <w:spacing w:line="276" w:lineRule="auto" w:after="120"/>
         <w:ind w:firstLine="709"/>
         <w:jc w:val="both"/>
@@ -125,6 +129,10 @@
     </w:p>
     <w:p>
       <w:pPr>
+        <w:keepNext/>
+        <w:keepLines/>
+        <w:pageBreakBefore/>
+        <w:widowControl/>
         <w:spacing w:before="240" w:after="120"/>
         <w:jc w:val="left"/>
       </w:pPr>
@@ -139,6 +147,7 @@
     </w:p>
     <w:p>
       <w:pPr>
+        <w:widowControl/>
         <w:spacing w:line="276" w:lineRule="auto" w:after="120"/>
         <w:ind w:firstLine="709"/>
         <w:jc w:val="both"/>
@@ -155,6 +164,7 @@
     </w:p>
     <w:p>
       <w:pPr>
+        <w:widowControl/>
         <w:spacing w:line="276" w:lineRule="auto" w:after="120"/>
         <w:ind w:firstLine="709"/>
         <w:jc w:val="both"/>
@@ -189,6 +199,9 @@
     </w:p>
     <w:p>
       <w:pPr>
+        <w:keepNext/>
+        <w:keepLines/>
+        <w:widowControl/>
         <w:spacing w:before="160" w:after="80"/>
         <w:jc w:val="left"/>
       </w:pPr>
@@ -203,6 +216,8 @@
     </w:p>
     <w:p>
       <w:pPr>
+        <w:keepLines/>
+        <w:widowControl/>
         <w:spacing w:line="276" w:lineRule="auto" w:after="60"/>
         <w:ind w:left="709"/>
         <w:jc w:val="both"/>
@@ -236,6 +251,8 @@
     </w:p>
     <w:p>
       <w:pPr>
+        <w:keepLines/>
+        <w:widowControl/>
         <w:spacing w:line="276" w:lineRule="auto" w:after="60"/>
         <w:ind w:left="709"/>
         <w:jc w:val="both"/>
@@ -269,6 +286,8 @@
     </w:p>
     <w:p>
       <w:pPr>
+        <w:keepLines/>
+        <w:widowControl/>
         <w:spacing w:line="276" w:lineRule="auto" w:after="60"/>
         <w:ind w:left="1134"/>
         <w:jc w:val="both"/>
@@ -293,6 +312,8 @@
     </w:p>
     <w:p>
       <w:pPr>
+        <w:keepLines/>
+        <w:widowControl/>
         <w:spacing w:line="276" w:lineRule="auto" w:after="60"/>
         <w:ind w:left="1134"/>
         <w:jc w:val="both"/>
@@ -317,6 +338,8 @@
     </w:p>
     <w:p>
       <w:pPr>
+        <w:keepLines/>
+        <w:widowControl/>
         <w:spacing w:line="276" w:lineRule="auto" w:after="60"/>
         <w:ind w:left="1134"/>
         <w:jc w:val="both"/>
@@ -341,6 +364,8 @@
     </w:p>
     <w:p>
       <w:pPr>
+        <w:keepLines/>
+        <w:widowControl/>
         <w:spacing w:line="276" w:lineRule="auto" w:after="60"/>
         <w:ind w:left="1134"/>
         <w:jc w:val="both"/>
@@ -365,6 +390,8 @@
     </w:p>
     <w:p>
       <w:pPr>
+        <w:keepLines/>
+        <w:widowControl/>
         <w:spacing w:line="276" w:lineRule="auto" w:after="60"/>
         <w:ind w:left="1134"/>
         <w:jc w:val="both"/>
@@ -389,6 +416,8 @@
     </w:p>
     <w:p>
       <w:pPr>
+        <w:keepLines/>
+        <w:widowControl/>
         <w:spacing w:line="276" w:lineRule="auto" w:after="60"/>
         <w:ind w:left="709"/>
         <w:jc w:val="both"/>
@@ -422,6 +451,8 @@
     </w:p>
     <w:p>
       <w:pPr>
+        <w:keepLines/>
+        <w:widowControl/>
         <w:spacing w:line="276" w:lineRule="auto" w:after="60"/>
         <w:ind w:left="709"/>
         <w:jc w:val="both"/>
@@ -455,6 +486,10 @@
     </w:p>
     <w:p>
       <w:pPr>
+        <w:keepNext/>
+        <w:keepLines/>
+        <w:pageBreakBefore/>
+        <w:widowControl/>
         <w:spacing w:before="240" w:after="120"/>
         <w:jc w:val="left"/>
       </w:pPr>
@@ -469,6 +504,8 @@
     </w:p>
     <w:p>
       <w:pPr>
+        <w:keepNext/>
+        <w:keepLines/>
         <w:spacing w:before="160" w:after="80"/>
         <w:ind w:firstLine="709"/>
         <w:jc w:val="left"/>
@@ -502,6 +539,10 @@
         <w:gridCol w:w="3118"/>
       </w:tblGrid>
       <w:tr>
+        <w:trPr>
+          <w:cantSplit/>
+          <w:tblHeader w:val="true"/>
+        </w:trPr>
         <w:tc>
           <w:tcPr>
             <w:tcW w:type="dxa" w:w="3118"/>
@@ -585,6 +626,9 @@
         </w:tc>
       </w:tr>
       <w:tr>
+        <w:trPr>
+          <w:cantSplit/>
+        </w:trPr>
         <w:tc>
           <w:tcPr>
             <w:tcW w:type="dxa" w:w="3118"/>
@@ -665,6 +709,9 @@
         </w:tc>
       </w:tr>
       <w:tr>
+        <w:trPr>
+          <w:cantSplit/>
+        </w:trPr>
         <w:tc>
           <w:tcPr>
             <w:tcW w:type="dxa" w:w="3118"/>
@@ -745,6 +792,9 @@
         </w:tc>
       </w:tr>
       <w:tr>
+        <w:trPr>
+          <w:cantSplit/>
+        </w:trPr>
         <w:tc>
           <w:tcPr>
             <w:tcW w:type="dxa" w:w="3118"/>
@@ -825,6 +875,9 @@
         </w:tc>
       </w:tr>
       <w:tr>
+        <w:trPr>
+          <w:cantSplit/>
+        </w:trPr>
         <w:tc>
           <w:tcPr>
             <w:tcW w:type="dxa" w:w="3118"/>
@@ -905,6 +958,9 @@
         </w:tc>
       </w:tr>
       <w:tr>
+        <w:trPr>
+          <w:cantSplit/>
+        </w:trPr>
         <w:tc>
           <w:tcPr>
             <w:tcW w:type="dxa" w:w="3118"/>
@@ -985,6 +1041,9 @@
         </w:tc>
       </w:tr>
       <w:tr>
+        <w:trPr>
+          <w:cantSplit/>
+        </w:trPr>
         <w:tc>
           <w:tcPr>
             <w:tcW w:type="dxa" w:w="3118"/>
@@ -1065,6 +1124,9 @@
         </w:tc>
       </w:tr>
       <w:tr>
+        <w:trPr>
+          <w:cantSplit/>
+        </w:trPr>
         <w:tc>
           <w:tcPr>
             <w:tcW w:type="dxa" w:w="3118"/>
@@ -1145,6 +1207,9 @@
         </w:tc>
       </w:tr>
       <w:tr>
+        <w:trPr>
+          <w:cantSplit/>
+        </w:trPr>
         <w:tc>
           <w:tcPr>
             <w:tcW w:type="dxa" w:w="3118"/>
@@ -1225,6 +1290,9 @@
         </w:tc>
       </w:tr>
       <w:tr>
+        <w:trPr>
+          <w:cantSplit/>
+        </w:trPr>
         <w:tc>
           <w:tcPr>
             <w:tcW w:type="dxa" w:w="3118"/>
@@ -1312,6 +1380,10 @@
     </w:p>
     <w:p>
       <w:pPr>
+        <w:keepNext/>
+        <w:keepLines/>
+        <w:pageBreakBefore/>
+        <w:widowControl/>
         <w:spacing w:before="240" w:after="120"/>
         <w:jc w:val="left"/>
       </w:pPr>
@@ -1326,6 +1398,7 @@
     </w:p>
     <w:p>
       <w:pPr>
+        <w:widowControl/>
         <w:spacing w:line="276" w:lineRule="auto" w:after="120"/>
         <w:ind w:firstLine="709"/>
         <w:jc w:val="both"/>
@@ -1342,13 +1415,15 @@
     </w:p>
     <w:p>
       <w:pPr>
+        <w:keepNext/>
+        <w:keepLines/>
         <w:spacing w:before="200" w:after="80"/>
         <w:jc w:val="center"/>
       </w:pPr>
       <w:r>
         <w:drawing>
           <wp:inline xmlns:a="http://schemas.openxmlformats.org/drawingml/2006/main" xmlns:pic="http://schemas.openxmlformats.org/drawingml/2006/picture">
-            <wp:extent cx="5760000" cy="4181918"/>
+            <wp:extent cx="5760000" cy="4181917"/>
             <wp:docPr id="1" name="Picture 1"/>
             <wp:cNvGraphicFramePr>
               <a:graphicFrameLocks noChangeAspect="1"/>
@@ -1369,7 +1444,7 @@
                   <pic:spPr>
                     <a:xfrm>
                       <a:off x="0" y="0"/>
-                      <a:ext cx="5760000" cy="4181918"/>
+                      <a:ext cx="5760000" cy="4181917"/>
                     </a:xfrm>
                     <a:prstGeom prst="rect"/>
                   </pic:spPr>
@@ -1382,6 +1457,8 @@
     </w:p>
     <w:p>
       <w:pPr>
+        <w:keepLines/>
+        <w:widowControl/>
         <w:spacing w:before="80" w:after="240"/>
         <w:jc w:val="center"/>
       </w:pPr>
@@ -1396,6 +1473,9 @@
     </w:p>
     <w:p>
       <w:pPr>
+        <w:keepNext/>
+        <w:keepLines/>
+        <w:widowControl/>
         <w:spacing w:before="160" w:after="80"/>
         <w:jc w:val="left"/>
       </w:pPr>
@@ -1410,6 +1490,8 @@
     </w:p>
     <w:p>
       <w:pPr>
+        <w:keepLines/>
+        <w:widowControl/>
         <w:spacing w:line="276" w:lineRule="auto" w:after="60"/>
         <w:ind w:left="709"/>
         <w:jc w:val="both"/>
@@ -1443,6 +1525,8 @@
     </w:p>
     <w:p>
       <w:pPr>
+        <w:keepLines/>
+        <w:widowControl/>
         <w:spacing w:line="276" w:lineRule="auto" w:after="60"/>
         <w:ind w:left="709"/>
         <w:jc w:val="both"/>
@@ -1476,6 +1560,8 @@
     </w:p>
     <w:p>
       <w:pPr>
+        <w:keepLines/>
+        <w:widowControl/>
         <w:spacing w:line="276" w:lineRule="auto" w:after="60"/>
         <w:ind w:left="709"/>
         <w:jc w:val="both"/>
@@ -1509,6 +1595,8 @@
     </w:p>
     <w:p>
       <w:pPr>
+        <w:keepLines/>
+        <w:widowControl/>
         <w:spacing w:line="276" w:lineRule="auto" w:after="60"/>
         <w:ind w:left="709"/>
         <w:jc w:val="both"/>
@@ -1542,6 +1630,8 @@
     </w:p>
     <w:p>
       <w:pPr>
+        <w:keepLines/>
+        <w:widowControl/>
         <w:spacing w:line="276" w:lineRule="auto" w:after="60"/>
         <w:ind w:left="709"/>
         <w:jc w:val="both"/>
@@ -1575,6 +1665,10 @@
     </w:p>
     <w:p>
       <w:pPr>
+        <w:keepNext/>
+        <w:keepLines/>
+        <w:pageBreakBefore/>
+        <w:widowControl/>
         <w:spacing w:before="240" w:after="120"/>
         <w:jc w:val="left"/>
       </w:pPr>
@@ -1589,6 +1683,9 @@
     </w:p>
     <w:p>
       <w:pPr>
+        <w:keepNext/>
+        <w:keepLines/>
+        <w:widowControl/>
         <w:spacing w:before="160" w:after="80"/>
         <w:jc w:val="left"/>
       </w:pPr>
@@ -1603,6 +1700,8 @@
     </w:p>
     <w:p>
       <w:pPr>
+        <w:keepLines/>
+        <w:widowControl/>
         <w:spacing w:line="276" w:lineRule="auto" w:after="60"/>
         <w:ind w:left="709"/>
         <w:jc w:val="both"/>
@@ -1636,6 +1735,8 @@
     </w:p>
     <w:p>
       <w:pPr>
+        <w:keepLines/>
+        <w:widowControl/>
         <w:spacing w:line="276" w:lineRule="auto" w:after="60"/>
         <w:ind w:left="709"/>
         <w:jc w:val="both"/>
@@ -1669,6 +1770,8 @@
     </w:p>
     <w:p>
       <w:pPr>
+        <w:keepLines/>
+        <w:widowControl/>
         <w:spacing w:line="276" w:lineRule="auto" w:after="60"/>
         <w:ind w:left="709"/>
         <w:jc w:val="both"/>
@@ -1702,6 +1805,8 @@
     </w:p>
     <w:p>
       <w:pPr>
+        <w:keepLines/>
+        <w:widowControl/>
         <w:spacing w:line="276" w:lineRule="auto" w:after="60"/>
         <w:ind w:left="709"/>
         <w:jc w:val="both"/>
@@ -1735,6 +1840,8 @@
     </w:p>
     <w:p>
       <w:pPr>
+        <w:keepLines/>
+        <w:widowControl/>
         <w:spacing w:line="276" w:lineRule="auto" w:after="60"/>
         <w:ind w:left="709"/>
         <w:jc w:val="both"/>
@@ -1768,6 +1875,8 @@
     </w:p>
     <w:p>
       <w:pPr>
+        <w:keepLines/>
+        <w:widowControl/>
         <w:spacing w:line="276" w:lineRule="auto" w:after="60"/>
         <w:ind w:left="709"/>
         <w:jc w:val="both"/>
@@ -1801,6 +1910,8 @@
     </w:p>
     <w:p>
       <w:pPr>
+        <w:keepLines/>
+        <w:widowControl/>
         <w:spacing w:line="276" w:lineRule="auto" w:after="60"/>
         <w:ind w:left="709"/>
         <w:jc w:val="both"/>
@@ -1834,6 +1945,8 @@
     </w:p>
     <w:p>
       <w:pPr>
+        <w:keepLines/>
+        <w:widowControl/>
         <w:spacing w:line="276" w:lineRule="auto" w:after="60"/>
         <w:ind w:left="709"/>
         <w:jc w:val="both"/>
@@ -1867,6 +1980,8 @@
     </w:p>
     <w:p>
       <w:pPr>
+        <w:keepLines/>
+        <w:widowControl/>
         <w:spacing w:line="276" w:lineRule="auto" w:after="60"/>
         <w:ind w:left="709"/>
         <w:jc w:val="both"/>
@@ -1900,6 +2015,8 @@
     </w:p>
     <w:p>
       <w:pPr>
+        <w:keepLines/>
+        <w:widowControl/>
         <w:spacing w:line="276" w:lineRule="auto" w:after="60"/>
         <w:ind w:left="709"/>
         <w:jc w:val="both"/>
@@ -1933,6 +2050,8 @@
     </w:p>
     <w:p>
       <w:pPr>
+        <w:keepLines/>
+        <w:widowControl/>
         <w:spacing w:line="276" w:lineRule="auto" w:after="60"/>
         <w:ind w:left="709"/>
         <w:jc w:val="both"/>
@@ -1966,6 +2085,8 @@
     </w:p>
     <w:p>
       <w:pPr>
+        <w:keepLines/>
+        <w:widowControl/>
         <w:spacing w:line="276" w:lineRule="auto" w:after="60"/>
         <w:ind w:left="709"/>
         <w:jc w:val="both"/>
@@ -1999,6 +2120,9 @@
     </w:p>
     <w:p>
       <w:pPr>
+        <w:keepNext/>
+        <w:keepLines/>
+        <w:widowControl/>
         <w:spacing w:before="160" w:after="80"/>
         <w:jc w:val="left"/>
       </w:pPr>
@@ -2013,6 +2137,8 @@
     </w:p>
     <w:p>
       <w:pPr>
+        <w:keepLines/>
+        <w:widowControl/>
         <w:spacing w:line="276" w:lineRule="auto" w:after="60"/>
         <w:ind w:left="709"/>
         <w:jc w:val="both"/>
@@ -2046,6 +2172,8 @@
     </w:p>
     <w:p>
       <w:pPr>
+        <w:keepLines/>
+        <w:widowControl/>
         <w:spacing w:line="276" w:lineRule="auto" w:after="60"/>
         <w:ind w:left="709"/>
         <w:jc w:val="both"/>
@@ -2097,6 +2225,8 @@
     </w:p>
     <w:p>
       <w:pPr>
+        <w:keepLines/>
+        <w:widowControl/>
         <w:spacing w:line="276" w:lineRule="auto" w:after="60"/>
         <w:ind w:left="709"/>
         <w:jc w:val="both"/>
@@ -2166,6 +2296,8 @@
     </w:p>
     <w:p>
       <w:pPr>
+        <w:keepLines/>
+        <w:widowControl/>
         <w:spacing w:line="276" w:lineRule="auto" w:after="60"/>
         <w:ind w:left="709"/>
         <w:jc w:val="both"/>
@@ -2199,6 +2331,8 @@
     </w:p>
     <w:p>
       <w:pPr>
+        <w:keepLines/>
+        <w:widowControl/>
         <w:spacing w:line="276" w:lineRule="auto" w:after="60"/>
         <w:ind w:left="709"/>
         <w:jc w:val="both"/>
@@ -2232,6 +2366,8 @@
     </w:p>
     <w:p>
       <w:pPr>
+        <w:keepLines/>
+        <w:widowControl/>
         <w:spacing w:line="276" w:lineRule="auto" w:after="60"/>
         <w:ind w:left="709"/>
         <w:jc w:val="both"/>
@@ -2265,6 +2401,10 @@
     </w:p>
     <w:p>
       <w:pPr>
+        <w:keepNext/>
+        <w:keepLines/>
+        <w:pageBreakBefore/>
+        <w:widowControl/>
         <w:spacing w:before="240" w:after="120"/>
         <w:jc w:val="left"/>
       </w:pPr>
@@ -2279,6 +2419,7 @@
     </w:p>
     <w:p>
       <w:pPr>
+        <w:widowControl/>
         <w:spacing w:line="276" w:lineRule="auto" w:after="120"/>
         <w:ind w:firstLine="709"/>
         <w:jc w:val="both"/>
@@ -2295,6 +2436,8 @@
     </w:p>
     <w:p>
       <w:pPr>
+        <w:keepNext/>
+        <w:keepLines/>
         <w:spacing w:before="160" w:after="80"/>
         <w:ind w:firstLine="709"/>
         <w:jc w:val="left"/>
@@ -2330,6 +2473,10 @@
         <w:gridCol w:w="1871"/>
       </w:tblGrid>
       <w:tr>
+        <w:trPr>
+          <w:cantSplit/>
+          <w:tblHeader w:val="true"/>
+        </w:trPr>
         <w:tc>
           <w:tcPr>
             <w:tcW w:type="dxa" w:w="1871"/>
@@ -2467,6 +2614,9 @@
         </w:tc>
       </w:tr>
       <w:tr>
+        <w:trPr>
+          <w:cantSplit/>
+        </w:trPr>
         <w:tc>
           <w:tcPr>
             <w:tcW w:type="dxa" w:w="1871"/>
@@ -2599,6 +2749,9 @@
         </w:tc>
       </w:tr>
       <w:tr>
+        <w:trPr>
+          <w:cantSplit/>
+        </w:trPr>
         <w:tc>
           <w:tcPr>
             <w:tcW w:type="dxa" w:w="1871"/>
@@ -2731,6 +2884,9 @@
         </w:tc>
       </w:tr>
       <w:tr>
+        <w:trPr>
+          <w:cantSplit/>
+        </w:trPr>
         <w:tc>
           <w:tcPr>
             <w:tcW w:type="dxa" w:w="1871"/>
@@ -2863,6 +3019,9 @@
         </w:tc>
       </w:tr>
       <w:tr>
+        <w:trPr>
+          <w:cantSplit/>
+        </w:trPr>
         <w:tc>
           <w:tcPr>
             <w:tcW w:type="dxa" w:w="1871"/>
@@ -2995,6 +3154,9 @@
         </w:tc>
       </w:tr>
       <w:tr>
+        <w:trPr>
+          <w:cantSplit/>
+        </w:trPr>
         <w:tc>
           <w:tcPr>
             <w:tcW w:type="dxa" w:w="1871"/>
@@ -3127,6 +3289,9 @@
         </w:tc>
       </w:tr>
       <w:tr>
+        <w:trPr>
+          <w:cantSplit/>
+        </w:trPr>
         <w:tc>
           <w:tcPr>
             <w:tcW w:type="dxa" w:w="1871"/>
@@ -3259,6 +3424,9 @@
         </w:tc>
       </w:tr>
       <w:tr>
+        <w:trPr>
+          <w:cantSplit/>
+        </w:trPr>
         <w:tc>
           <w:tcPr>
             <w:tcW w:type="dxa" w:w="1871"/>
@@ -3391,6 +3559,9 @@
         </w:tc>
       </w:tr>
       <w:tr>
+        <w:trPr>
+          <w:cantSplit/>
+        </w:trPr>
         <w:tc>
           <w:tcPr>
             <w:tcW w:type="dxa" w:w="1871"/>
@@ -3530,6 +3701,9 @@
     </w:p>
     <w:p>
       <w:pPr>
+        <w:keepNext/>
+        <w:keepLines/>
+        <w:widowControl/>
         <w:spacing w:before="160" w:after="80"/>
         <w:jc w:val="left"/>
       </w:pPr>
@@ -3544,6 +3718,7 @@
     </w:p>
     <w:p>
       <w:pPr>
+        <w:widowControl/>
         <w:spacing w:line="276" w:lineRule="auto" w:after="120"/>
         <w:ind w:firstLine="709"/>
         <w:jc w:val="both"/>
@@ -3578,6 +3753,8 @@
     </w:p>
     <w:p>
       <w:pPr>
+        <w:keepLines/>
+        <w:widowControl/>
         <w:spacing w:line="276" w:lineRule="auto" w:after="60"/>
         <w:ind w:left="709"/>
         <w:jc w:val="both"/>
@@ -3611,6 +3788,8 @@
     </w:p>
     <w:p>
       <w:pPr>
+        <w:keepLines/>
+        <w:widowControl/>
         <w:spacing w:line="276" w:lineRule="auto" w:after="60"/>
         <w:ind w:left="709"/>
         <w:jc w:val="both"/>
@@ -3644,6 +3823,8 @@
     </w:p>
     <w:p>
       <w:pPr>
+        <w:keepLines/>
+        <w:widowControl/>
         <w:spacing w:line="276" w:lineRule="auto" w:after="60"/>
         <w:ind w:left="709"/>
         <w:jc w:val="both"/>
@@ -3677,6 +3858,10 @@
     </w:p>
     <w:p>
       <w:pPr>
+        <w:keepNext/>
+        <w:keepLines/>
+        <w:pageBreakBefore/>
+        <w:widowControl/>
         <w:spacing w:before="240" w:after="120"/>
         <w:jc w:val="left"/>
       </w:pPr>
@@ -3691,6 +3876,7 @@
     </w:p>
     <w:p>
       <w:pPr>
+        <w:widowControl/>
         <w:spacing w:line="276" w:lineRule="auto" w:after="120"/>
         <w:ind w:firstLine="709"/>
         <w:jc w:val="both"/>

</xml_diff>